<commit_message>
Propuesta operativa: panel de la estratega y panel del creador, niveles de autonomía y gráficas del estilo de la plataforma (página, PDF y Word)
Co-Authored-By: Claude Sonnet 5.5 <noreply@anthropic.com>
Claude-Session: https://claude.ai/code/session_01Qz2v3pBufXuWxCEeuDhn6M dariocsosa/truthframe@42984e4a9a64849afdff822990f60341b49ba40e
</commit_message>
<xml_diff>
--- a/assets/diana/Diana_Cardona_Propuesta_Operativa.docx
+++ b/assets/diana/Diana_Cardona_Propuesta_Operativa.docx
@@ -200,6 +200,25 @@
     </w:p>
     <w:p>
       <w:pPr>
+        <w:pBdr>
+          <w:left w:val="single" w:color="F24E55" w:sz="24" w:space="8"/>
+        </w:pBdr>
+        <w:spacing w:after="120" w:before="120"/>
+        <w:ind w:left="200"/>
+      </w:pPr>
+      <w:r>
+        <w:rPr>
+          <w:rFonts w:ascii="Arial" w:cs="Arial" w:eastAsia="Arial" w:hAnsi="Arial"/>
+          <w:b/>
+          <w:bCs/>
+          <w:sz w:val="23"/>
+          <w:szCs w:val="23"/>
+        </w:rPr>
+        <w:t xml:space="preserve">La plataforma entrega la evidencia. Las decisiones importantes las toman siempre las personas.</w:t>
+      </w:r>
+    </w:p>
+    <w:p>
+      <w:pPr>
         <w:keepNext/>
         <w:pBdr>
           <w:top w:val="single" w:color="1D1D1D" w:sz="12" w:space="6"/>
@@ -327,7 +346,7 @@
                 <w:sz w:val="17"/>
                 <w:szCs w:val="17"/>
               </w:rPr>
-              <w:t xml:space="preserve">2. Wiki</w:t>
+              <w:t xml:space="preserve">2. Base</w:t>
             </w:r>
           </w:p>
           <w:p>
@@ -387,7 +406,7 @@
                 <w:sz w:val="17"/>
                 <w:szCs w:val="17"/>
               </w:rPr>
-              <w:t xml:space="preserve">3. Diagnóstico</w:t>
+              <w:t xml:space="preserve">3. Evidencia</w:t>
             </w:r>
           </w:p>
           <w:p>
@@ -400,7 +419,7 @@
                 <w:sz w:val="16"/>
                 <w:szCs w:val="16"/>
               </w:rPr>
-              <w:t xml:space="preserve">Métricas del canal cruzadas con sus temas, posturas y vacíos de contenido.</w:t>
+              <w:t xml:space="preserve">Métricas del canal cruzadas con sus temas, posturas y vacíos.</w:t>
             </w:r>
           </w:p>
           <w:p>
@@ -414,7 +433,7 @@
                 <w:sz w:val="14"/>
                 <w:szCs w:val="14"/>
               </w:rPr>
-              <w:t xml:space="preserve">La estratega lo revisa y lo afina.</w:t>
+              <w:t xml:space="preserve">Llega lista a la estratega.</w:t>
             </w:r>
           </w:p>
         </w:tc>
@@ -447,7 +466,7 @@
                 <w:sz w:val="17"/>
                 <w:szCs w:val="17"/>
               </w:rPr>
-              <w:t xml:space="preserve">4. Sesión</w:t>
+              <w:t xml:space="preserve">4. Decisión</w:t>
             </w:r>
           </w:p>
           <w:p>
@@ -460,7 +479,7 @@
                 <w:sz w:val="16"/>
                 <w:szCs w:val="16"/>
               </w:rPr>
-              <w:t xml:space="preserve">1 a 1, o en una clínica de 5 creadores del mismo nivel.</w:t>
+              <w:t xml:space="preserve">La estratega y el creador deciden la estrategia, en sesión 1 a 1 o en clínica de 5.</w:t>
             </w:r>
           </w:p>
           <w:p>
@@ -474,7 +493,7 @@
                 <w:sz w:val="14"/>
                 <w:szCs w:val="14"/>
               </w:rPr>
-              <w:t xml:space="preserve">Foco en la dirección estratégica.</w:t>
+              <w:t xml:space="preserve">El creador decide lo táctico.</w:t>
             </w:r>
           </w:p>
         </w:tc>
@@ -520,7 +539,7 @@
                 <w:sz w:val="16"/>
                 <w:szCs w:val="16"/>
               </w:rPr>
-              <w:t xml:space="preserve">Cada mes, temas propuestos con sus propias palabras y cifras.</w:t>
+              <w:t xml:space="preserve">Cada mes, propuestas con sus propias palabras y cifras. Se mide y se ajusta.</w:t>
             </w:r>
           </w:p>
           <w:p>
@@ -534,27 +553,12 @@
                 <w:sz w:val="14"/>
                 <w:szCs w:val="14"/>
               </w:rPr>
-              <w:t xml:space="preserve">Se mide y se ajusta.</w:t>
+              <w:t xml:space="preserve">Lo medido vuelve a la base.</w:t>
             </w:r>
           </w:p>
         </w:tc>
       </w:tr>
     </w:tbl>
-    <w:p>
-      <w:pPr>
-        <w:spacing w:after="120" w:before="80"/>
-        <w:jc w:val="center"/>
-      </w:pPr>
-      <w:r>
-        <w:rPr>
-          <w:rFonts w:ascii="Arial" w:cs="Arial" w:eastAsia="Arial" w:hAnsi="Arial"/>
-          <w:color w:val="5A5752"/>
-          <w:sz w:val="17"/>
-          <w:szCs w:val="17"/>
-        </w:rPr>
-        <w:t xml:space="preserve">Lo medido en el mes vuelve al wiki y el ciclo siguiente parte de lo aprendido.</w:t>
-      </w:r>
-    </w:p>
     <w:p>
       <w:pPr>
         <w:keepNext/>
@@ -667,7 +671,7 @@
           <w:sz w:val="17"/>
           <w:szCs w:val="17"/>
         </w:rPr>
-        <w:t xml:space="preserve">LA PLATAFORMA</w:t>
+        <w:t xml:space="preserve">UNA BASE DE CONOCIMIENTO, DOS PANELES</w:t>
       </w:r>
     </w:p>
     <w:p>
@@ -680,7 +684,160 @@
           <w:sz w:val="21"/>
           <w:szCs w:val="21"/>
         </w:rPr>
-        <w:t xml:space="preserve">Esta es la pantalla de diagnóstico que vería la estratega antes de cada sesión. Junta dos capas: las métricas de YouTube, que Eloísa ya sabe leer, y el conocimiento que hay dentro de los contenidos del creador: de qué habla, qué posturas tiene, dónde se contradice y qué le falta decir. La novedad es el cruce entre las dos.</w:t>
+        <w:t xml:space="preserve">Cada creador tiene su propia base de conocimiento. Sobre ella se abren dos paneles, según quién decide y qué decide. En los dos se aplican las </w:t>
+      </w:r>
+      <w:r>
+        <w:rPr>
+          <w:rFonts w:ascii="Arial" w:cs="Arial" w:eastAsia="Arial" w:hAnsi="Arial"/>
+          <w:b/>
+          <w:bCs/>
+          <w:sz w:val="21"/>
+          <w:szCs w:val="21"/>
+        </w:rPr>
+        <w:t xml:space="preserve">reglas y los conceptos de Eloísa</w:t>
+      </w:r>
+      <w:r>
+        <w:rPr>
+          <w:rFonts w:ascii="Arial" w:cs="Arial" w:eastAsia="Arial" w:hAnsi="Arial"/>
+          <w:sz w:val="21"/>
+          <w:szCs w:val="21"/>
+        </w:rPr>
+        <w:t xml:space="preserve">, que se cargan una vez en la plataforma.</w:t>
+      </w:r>
+    </w:p>
+    <w:p>
+      <w:pPr>
+        <w:spacing w:after="80" w:before="80"/>
+        <w:jc w:val="center"/>
+      </w:pPr>
+      <w:r>
+        <w:drawing>
+          <wp:inline distT="0" distB="0" distL="0" distR="0">
+            <wp:extent cx="6115050" cy="1924050"/>
+            <wp:effectExtent t="0" r="0" b="0" l="0"/>
+            <wp:docPr id="1" name="img_flujo.png" descr="img_flujo.png" title="img_flujo.png"/>
+            <wp:cNvGraphicFramePr>
+              <a:graphicFrameLocks xmlns:a="http://schemas.openxmlformats.org/drawingml/2006/main" noChangeAspect="1"/>
+            </wp:cNvGraphicFramePr>
+            <a:graphic xmlns:a="http://schemas.openxmlformats.org/drawingml/2006/main">
+              <a:graphicData uri="http://schemas.openxmlformats.org/drawingml/2006/picture">
+                <pic:pic xmlns:pic="http://schemas.openxmlformats.org/drawingml/2006/picture">
+                  <pic:nvPicPr>
+                    <pic:cNvPr id="0" name="" descr=""/>
+                    <pic:cNvPicPr>
+                      <a:picLocks noChangeAspect="1" noChangeArrowheads="1"/>
+                    </pic:cNvPicPr>
+                  </pic:nvPicPr>
+                  <pic:blipFill>
+                    <a:blip r:embed="rId8" cstate="none"/>
+                    <a:srcRect/>
+                    <a:stretch>
+                      <a:fillRect/>
+                    </a:stretch>
+                  </pic:blipFill>
+                  <pic:spPr bwMode="auto">
+                    <a:xfrm>
+                      <a:off x="0" y="0"/>
+                      <a:ext cx="6115050" cy="1924050"/>
+                    </a:xfrm>
+                    <a:prstGeom prst="rect">
+                      <a:avLst/>
+                    </a:prstGeom>
+                  </pic:spPr>
+                </pic:pic>
+              </a:graphicData>
+            </a:graphic>
+          </wp:inline>
+        </w:drawing>
+      </w:r>
+    </w:p>
+    <w:p>
+      <w:pPr>
+        <w:pStyle w:val="ListParagraph"/>
+        <w:numPr>
+          <w:ilvl w:val="0"/>
+          <w:numId w:val="2"/>
+        </w:numPr>
+        <w:spacing w:after="70" w:line="290"/>
+      </w:pPr>
+      <w:r>
+        <w:rPr>
+          <w:rFonts w:ascii="Arial" w:cs="Arial" w:eastAsia="Arial" w:hAnsi="Arial"/>
+          <w:b/>
+          <w:bCs/>
+          <w:sz w:val="21"/>
+          <w:szCs w:val="21"/>
+        </w:rPr>
+        <w:t xml:space="preserve">Panel de la estratega. </w:t>
+      </w:r>
+      <w:r>
+        <w:rPr>
+          <w:rFonts w:ascii="Arial" w:cs="Arial" w:eastAsia="Arial" w:hAnsi="Arial"/>
+          <w:sz w:val="21"/>
+          <w:szCs w:val="21"/>
+        </w:rPr>
+        <w:t xml:space="preserve">Tiene cargadas todas las métricas del canal, las voces y los estilos del creador. Le sirve para ayudarle a tomar decisiones estratégicas: hacia dónde llevar el canal, qué temas y formatos priorizar.</w:t>
+      </w:r>
+    </w:p>
+    <w:p>
+      <w:pPr>
+        <w:pStyle w:val="ListParagraph"/>
+        <w:numPr>
+          <w:ilvl w:val="0"/>
+          <w:numId w:val="2"/>
+        </w:numPr>
+        <w:spacing w:after="70" w:line="290"/>
+      </w:pPr>
+      <w:r>
+        <w:rPr>
+          <w:rFonts w:ascii="Arial" w:cs="Arial" w:eastAsia="Arial" w:hAnsi="Arial"/>
+          <w:b/>
+          <w:bCs/>
+          <w:sz w:val="21"/>
+          <w:szCs w:val="21"/>
+        </w:rPr>
+        <w:t xml:space="preserve">Panel del creador. </w:t>
+      </w:r>
+      <w:r>
+        <w:rPr>
+          <w:rFonts w:ascii="Arial" w:cs="Arial" w:eastAsia="Arial" w:hAnsi="Arial"/>
+          <w:sz w:val="21"/>
+          <w:szCs w:val="21"/>
+        </w:rPr>
+        <w:t xml:space="preserve">Ve su propia base de conocimiento y decide sobre su contenido día a día, con base en lo que él mismo ha dicho y con las reglas de Eloísa aplicadas. Son las decisiones tácticas.</w:t>
+      </w:r>
+    </w:p>
+    <w:p>
+      <w:pPr>
+        <w:keepNext/>
+        <w:pBdr>
+          <w:top w:val="single" w:color="1D1D1D" w:sz="12" w:space="6"/>
+        </w:pBdr>
+        <w:spacing w:after="120" w:before="280"/>
+      </w:pPr>
+      <w:r>
+        <w:rPr>
+          <w:rFonts w:ascii="Arial" w:cs="Arial" w:eastAsia="Arial" w:hAnsi="Arial"/>
+          <w:b/>
+          <w:bCs/>
+          <w:spacing w:val="40"/>
+          <w:sz w:val="17"/>
+          <w:szCs w:val="17"/>
+        </w:rPr>
+        <w:t xml:space="preserve">QUÉ HACE LA PLATAFORMA Y QUÉ DECIDEN LAS PERSONAS</w:t>
+      </w:r>
+    </w:p>
+    <w:p>
+      <w:pPr>
+        <w:spacing w:after="120" w:line="300"/>
+      </w:pPr>
+      <w:r>
+        <w:rPr>
+          <w:rFonts w:ascii="Arial" w:cs="Arial" w:eastAsia="Arial" w:hAnsi="Arial"/>
+          <w:sz w:val="21"/>
+          <w:szCs w:val="21"/>
+        </w:rPr>
+        <w:t xml:space="preserve">La plataforma trabaja con cuatro niveles de autonomía. Cuanto más pesa una decisión, más arriba sube de nivel, y las decisiones importantes nunca las toma sola.</w:t>
       </w:r>
     </w:p>
     <w:tbl>
@@ -696,1101 +853,680 @@
         </w:tblBorders>
       </w:tblPr>
       <w:tblGrid>
-        <w:gridCol w:w="4819"/>
-        <w:gridCol w:w="4819"/>
+        <w:gridCol w:w="1100"/>
+        <w:gridCol w:w="2300"/>
+        <w:gridCol w:w="3438"/>
+        <w:gridCol w:w="2800"/>
       </w:tblGrid>
       <w:tr>
-        <w:tc>
-          <w:tcPr>
-            <w:tcW w:type="dxa" w:w="9638"/>
-            <w:gridSpan w:val="2"/>
-            <w:tcBorders>
-              <w:top w:val="single" w:color="0E0E0E" w:sz="6"/>
-              <w:left w:val="single" w:color="0E0E0E" w:sz="6"/>
-              <w:bottom w:val="single" w:color="0E0E0E" w:sz="6"/>
-              <w:right w:val="single" w:color="0E0E0E" w:sz="6"/>
-            </w:tcBorders>
-            <w:shd w:fill="161616" w:color="auto" w:val="clear"/>
-            <w:tcMar>
-              <w:top w:type="dxa" w:w="90"/>
-              <w:left w:type="dxa" w:w="130"/>
-              <w:bottom w:type="dxa" w:w="90"/>
-              <w:right w:type="dxa" w:w="130"/>
-            </w:tcMar>
-          </w:tcPr>
-          <w:p>
-            <w:pPr>
-              <w:spacing w:after="0"/>
+        <w:trPr>
+          <w:tblHeader/>
+        </w:trPr>
+        <w:tc>
+          <w:tcPr>
+            <w:tcW w:type="dxa" w:w="1100"/>
+            <w:tcBorders>
+              <w:top w:val="single" w:color="DCD9D3" w:sz="4"/>
+              <w:left w:val="single" w:color="DCD9D3" w:sz="4"/>
+              <w:bottom w:val="single" w:color="DCD9D3" w:sz="4"/>
+              <w:right w:val="single" w:color="DCD9D3" w:sz="4"/>
+            </w:tcBorders>
+            <w:shd w:fill="F3F2EE" w:color="auto" w:val="clear"/>
+            <w:tcMar>
+              <w:top w:type="dxa" w:w="90"/>
+              <w:left w:type="dxa" w:w="130"/>
+              <w:bottom w:type="dxa" w:w="90"/>
+              <w:right w:type="dxa" w:w="130"/>
+            </w:tcMar>
+          </w:tcPr>
+          <w:p>
+            <w:pPr>
+              <w:spacing w:after="0" w:line="270"/>
             </w:pPr>
             <w:r>
               <w:rPr>
                 <w:rFonts w:ascii="Arial" w:cs="Arial" w:eastAsia="Arial" w:hAnsi="Arial"/>
                 <w:b/>
                 <w:bCs/>
-                <w:color w:val="FFFFFF"/>
+                <w:color w:val="5A5752"/>
+                <w:sz w:val="16"/>
+                <w:szCs w:val="16"/>
+              </w:rPr>
+              <w:t xml:space="preserve">Nivel</w:t>
+            </w:r>
+          </w:p>
+        </w:tc>
+        <w:tc>
+          <w:tcPr>
+            <w:tcW w:type="dxa" w:w="2300"/>
+            <w:tcBorders>
+              <w:top w:val="single" w:color="DCD9D3" w:sz="4"/>
+              <w:left w:val="single" w:color="DCD9D3" w:sz="4"/>
+              <w:bottom w:val="single" w:color="DCD9D3" w:sz="4"/>
+              <w:right w:val="single" w:color="DCD9D3" w:sz="4"/>
+            </w:tcBorders>
+            <w:shd w:fill="F3F2EE" w:color="auto" w:val="clear"/>
+            <w:tcMar>
+              <w:top w:type="dxa" w:w="90"/>
+              <w:left w:type="dxa" w:w="130"/>
+              <w:bottom w:type="dxa" w:w="90"/>
+              <w:right w:type="dxa" w:w="130"/>
+            </w:tcMar>
+          </w:tcPr>
+          <w:p>
+            <w:pPr>
+              <w:spacing w:after="0" w:line="270"/>
+            </w:pPr>
+            <w:r>
+              <w:rPr>
+                <w:rFonts w:ascii="Arial" w:cs="Arial" w:eastAsia="Arial" w:hAnsi="Arial"/>
+                <w:b/>
+                <w:bCs/>
+                <w:color w:val="5A5752"/>
+                <w:sz w:val="16"/>
+                <w:szCs w:val="16"/>
+              </w:rPr>
+              <w:t xml:space="preserve">Qué hace</w:t>
+            </w:r>
+          </w:p>
+        </w:tc>
+        <w:tc>
+          <w:tcPr>
+            <w:tcW w:type="dxa" w:w="3438"/>
+            <w:tcBorders>
+              <w:top w:val="single" w:color="DCD9D3" w:sz="4"/>
+              <w:left w:val="single" w:color="DCD9D3" w:sz="4"/>
+              <w:bottom w:val="single" w:color="DCD9D3" w:sz="4"/>
+              <w:right w:val="single" w:color="DCD9D3" w:sz="4"/>
+            </w:tcBorders>
+            <w:shd w:fill="F3F2EE" w:color="auto" w:val="clear"/>
+            <w:tcMar>
+              <w:top w:type="dxa" w:w="90"/>
+              <w:left w:type="dxa" w:w="130"/>
+              <w:bottom w:type="dxa" w:w="90"/>
+              <w:right w:type="dxa" w:w="130"/>
+            </w:tcMar>
+          </w:tcPr>
+          <w:p>
+            <w:pPr>
+              <w:spacing w:after="0" w:line="270"/>
+            </w:pPr>
+            <w:r>
+              <w:rPr>
+                <w:rFonts w:ascii="Arial" w:cs="Arial" w:eastAsia="Arial" w:hAnsi="Arial"/>
+                <w:b/>
+                <w:bCs/>
+                <w:color w:val="5A5752"/>
+                <w:sz w:val="16"/>
+                <w:szCs w:val="16"/>
+              </w:rPr>
+              <w:t xml:space="preserve">Ejemplos</w:t>
+            </w:r>
+          </w:p>
+        </w:tc>
+        <w:tc>
+          <w:tcPr>
+            <w:tcW w:type="dxa" w:w="2800"/>
+            <w:tcBorders>
+              <w:top w:val="single" w:color="DCD9D3" w:sz="4"/>
+              <w:left w:val="single" w:color="DCD9D3" w:sz="4"/>
+              <w:bottom w:val="single" w:color="DCD9D3" w:sz="4"/>
+              <w:right w:val="single" w:color="DCD9D3" w:sz="4"/>
+            </w:tcBorders>
+            <w:shd w:fill="F3F2EE" w:color="auto" w:val="clear"/>
+            <w:tcMar>
+              <w:top w:type="dxa" w:w="90"/>
+              <w:left w:type="dxa" w:w="130"/>
+              <w:bottom w:type="dxa" w:w="90"/>
+              <w:right w:type="dxa" w:w="130"/>
+            </w:tcMar>
+          </w:tcPr>
+          <w:p>
+            <w:pPr>
+              <w:spacing w:after="0" w:line="270"/>
+            </w:pPr>
+            <w:r>
+              <w:rPr>
+                <w:rFonts w:ascii="Arial" w:cs="Arial" w:eastAsia="Arial" w:hAnsi="Arial"/>
+                <w:b/>
+                <w:bCs/>
+                <w:color w:val="5A5752"/>
+                <w:sz w:val="16"/>
+                <w:szCs w:val="16"/>
+              </w:rPr>
+              <w:t xml:space="preserve">Quién decide</w:t>
+            </w:r>
+          </w:p>
+        </w:tc>
+      </w:tr>
+      <w:tr>
+        <w:trPr>
+          <w:tblHeader w:val="off"/>
+        </w:trPr>
+        <w:tc>
+          <w:tcPr>
+            <w:tcW w:type="dxa" w:w="1100"/>
+            <w:tcBorders>
+              <w:top w:val="single" w:color="DCD9D3" w:sz="4"/>
+              <w:left w:val="single" w:color="DCD9D3" w:sz="4"/>
+              <w:bottom w:val="single" w:color="DCD9D3" w:sz="4"/>
+              <w:right w:val="single" w:color="DCD9D3" w:sz="4"/>
+            </w:tcBorders>
+            <w:tcMar>
+              <w:top w:type="dxa" w:w="90"/>
+              <w:left w:type="dxa" w:w="130"/>
+              <w:bottom w:type="dxa" w:w="90"/>
+              <w:right w:type="dxa" w:w="130"/>
+            </w:tcMar>
+          </w:tcPr>
+          <w:p>
+            <w:pPr>
+              <w:spacing w:after="0" w:line="270"/>
+            </w:pPr>
+            <w:r>
+              <w:rPr>
+                <w:rFonts w:ascii="Arial" w:cs="Arial" w:eastAsia="Arial" w:hAnsi="Arial"/>
+                <w:b/>
+                <w:bCs/>
                 <w:sz w:val="18"/>
                 <w:szCs w:val="18"/>
               </w:rPr>
-              <w:t xml:space="preserve">Canal de ejemplo</w:t>
-            </w:r>
-            <w:r>
-              <w:rPr>
-                <w:rFonts w:ascii="Arial" w:cs="Arial" w:eastAsia="Arial" w:hAnsi="Arial"/>
-                <w:color w:val="B5B2AC"/>
-                <w:sz w:val="15"/>
-                <w:szCs w:val="15"/>
-              </w:rPr>
-              <w:t xml:space="preserve">  · 212 videos · 2019–2026      DATOS ILUSTRATIVOS</w:t>
+              <w:t xml:space="preserve">Nivel 0</w:t>
+            </w:r>
+          </w:p>
+        </w:tc>
+        <w:tc>
+          <w:tcPr>
+            <w:tcW w:type="dxa" w:w="2300"/>
+            <w:tcBorders>
+              <w:top w:val="single" w:color="DCD9D3" w:sz="4"/>
+              <w:left w:val="single" w:color="DCD9D3" w:sz="4"/>
+              <w:bottom w:val="single" w:color="DCD9D3" w:sz="4"/>
+              <w:right w:val="single" w:color="DCD9D3" w:sz="4"/>
+            </w:tcBorders>
+            <w:tcMar>
+              <w:top w:type="dxa" w:w="90"/>
+              <w:left w:type="dxa" w:w="130"/>
+              <w:bottom w:type="dxa" w:w="90"/>
+              <w:right w:type="dxa" w:w="130"/>
+            </w:tcMar>
+          </w:tcPr>
+          <w:p>
+            <w:pPr>
+              <w:spacing w:after="0" w:line="270"/>
+            </w:pPr>
+            <w:r>
+              <w:rPr>
+                <w:rFonts w:ascii="Arial" w:cs="Arial" w:eastAsia="Arial" w:hAnsi="Arial"/>
+                <w:b w:val="false"/>
+                <w:bCs w:val="false"/>
+                <w:sz w:val="18"/>
+                <w:szCs w:val="18"/>
+              </w:rPr>
+              <w:t xml:space="preserve">La plataforma lo hace sola</w:t>
+            </w:r>
+          </w:p>
+        </w:tc>
+        <w:tc>
+          <w:tcPr>
+            <w:tcW w:type="dxa" w:w="3438"/>
+            <w:tcBorders>
+              <w:top w:val="single" w:color="DCD9D3" w:sz="4"/>
+              <w:left w:val="single" w:color="DCD9D3" w:sz="4"/>
+              <w:bottom w:val="single" w:color="DCD9D3" w:sz="4"/>
+              <w:right w:val="single" w:color="DCD9D3" w:sz="4"/>
+            </w:tcBorders>
+            <w:tcMar>
+              <w:top w:type="dxa" w:w="90"/>
+              <w:left w:type="dxa" w:w="130"/>
+              <w:bottom w:type="dxa" w:w="90"/>
+              <w:right w:type="dxa" w:w="130"/>
+            </w:tcMar>
+          </w:tcPr>
+          <w:p>
+            <w:pPr>
+              <w:spacing w:after="0" w:line="270"/>
+            </w:pPr>
+            <w:r>
+              <w:rPr>
+                <w:rFonts w:ascii="Arial" w:cs="Arial" w:eastAsia="Arial" w:hAnsi="Arial"/>
+                <w:b w:val="false"/>
+                <w:bCs w:val="false"/>
+                <w:sz w:val="18"/>
+                <w:szCs w:val="18"/>
+              </w:rPr>
+              <w:t xml:space="preserve">Traer los videos y métricas públicas, actualizar la base, registrar cada cambio.</w:t>
+            </w:r>
+          </w:p>
+        </w:tc>
+        <w:tc>
+          <w:tcPr>
+            <w:tcW w:type="dxa" w:w="2800"/>
+            <w:tcBorders>
+              <w:top w:val="single" w:color="DCD9D3" w:sz="4"/>
+              <w:left w:val="single" w:color="DCD9D3" w:sz="4"/>
+              <w:bottom w:val="single" w:color="DCD9D3" w:sz="4"/>
+              <w:right w:val="single" w:color="DCD9D3" w:sz="4"/>
+            </w:tcBorders>
+            <w:tcMar>
+              <w:top w:type="dxa" w:w="90"/>
+              <w:left w:type="dxa" w:w="130"/>
+              <w:bottom w:type="dxa" w:w="90"/>
+              <w:right w:type="dxa" w:w="130"/>
+            </w:tcMar>
+          </w:tcPr>
+          <w:p>
+            <w:pPr>
+              <w:spacing w:after="0" w:line="270"/>
+            </w:pPr>
+            <w:r>
+              <w:rPr>
+                <w:rFonts w:ascii="Arial" w:cs="Arial" w:eastAsia="Arial" w:hAnsi="Arial"/>
+                <w:b w:val="false"/>
+                <w:bCs w:val="false"/>
+                <w:sz w:val="18"/>
+                <w:szCs w:val="18"/>
+              </w:rPr>
+              <w:t xml:space="preserve">Nadie decide: queda en el historial.</w:t>
             </w:r>
           </w:p>
         </w:tc>
       </w:tr>
       <w:tr>
-        <w:tc>
-          <w:tcPr>
-            <w:tcW w:type="dxa" w:w="4819"/>
-            <w:tcBorders>
-              <w:top w:val="single" w:color="0E0E0E" w:sz="6"/>
-              <w:left w:val="single" w:color="0E0E0E" w:sz="6"/>
-              <w:bottom w:val="single" w:color="0E0E0E" w:sz="6"/>
-              <w:right w:val="single" w:color="0E0E0E" w:sz="6"/>
-            </w:tcBorders>
-            <w:shd w:fill="1E1E1E" w:color="auto" w:val="clear"/>
-            <w:tcMar>
-              <w:top w:type="dxa" w:w="90"/>
-              <w:left w:type="dxa" w:w="130"/>
-              <w:bottom w:type="dxa" w:w="90"/>
-              <w:right w:type="dxa" w:w="130"/>
-            </w:tcMar>
-          </w:tcPr>
-          <w:p>
-            <w:pPr>
-              <w:spacing w:after="70"/>
+        <w:trPr>
+          <w:tblHeader w:val="off"/>
+        </w:trPr>
+        <w:tc>
+          <w:tcPr>
+            <w:tcW w:type="dxa" w:w="1100"/>
+            <w:tcBorders>
+              <w:top w:val="single" w:color="DCD9D3" w:sz="4"/>
+              <w:left w:val="single" w:color="DCD9D3" w:sz="4"/>
+              <w:bottom w:val="single" w:color="DCD9D3" w:sz="4"/>
+              <w:right w:val="single" w:color="DCD9D3" w:sz="4"/>
+            </w:tcBorders>
+            <w:tcMar>
+              <w:top w:type="dxa" w:w="90"/>
+              <w:left w:type="dxa" w:w="130"/>
+              <w:bottom w:type="dxa" w:w="90"/>
+              <w:right w:type="dxa" w:w="130"/>
+            </w:tcMar>
+          </w:tcPr>
+          <w:p>
+            <w:pPr>
+              <w:spacing w:after="0" w:line="270"/>
             </w:pPr>
             <w:r>
               <w:rPr>
                 <w:rFonts w:ascii="Arial" w:cs="Arial" w:eastAsia="Arial" w:hAnsi="Arial"/>
                 <w:b/>
                 <w:bCs/>
-                <w:color w:val="B5B2AC"/>
-                <w:spacing w:val="20"/>
-                <w:sz w:val="14"/>
-                <w:szCs w:val="14"/>
-              </w:rPr>
-              <w:t xml:space="preserve">DE YOUTUBE</w:t>
-            </w:r>
-            <w:r>
-              <w:rPr>
-                <w:rFonts w:ascii="Arial" w:cs="Arial" w:eastAsia="Arial" w:hAnsi="Arial"/>
-                <w:color w:val="8D8A84"/>
-                <w:sz w:val="14"/>
-                <w:szCs w:val="14"/>
-              </w:rPr>
-              <w:t xml:space="preserve">  · lo que ya lees</w:t>
-            </w:r>
-          </w:p>
-          <w:p>
-            <w:pPr>
-              <w:spacing w:after="40" w:line="260"/>
+                <w:sz w:val="18"/>
+                <w:szCs w:val="18"/>
+              </w:rPr>
+              <w:t xml:space="preserve">Nivel 1</w:t>
+            </w:r>
+          </w:p>
+        </w:tc>
+        <w:tc>
+          <w:tcPr>
+            <w:tcW w:type="dxa" w:w="2300"/>
+            <w:tcBorders>
+              <w:top w:val="single" w:color="DCD9D3" w:sz="4"/>
+              <w:left w:val="single" w:color="DCD9D3" w:sz="4"/>
+              <w:bottom w:val="single" w:color="DCD9D3" w:sz="4"/>
+              <w:right w:val="single" w:color="DCD9D3" w:sz="4"/>
+            </w:tcBorders>
+            <w:tcMar>
+              <w:top w:type="dxa" w:w="90"/>
+              <w:left w:type="dxa" w:w="130"/>
+              <w:bottom w:type="dxa" w:w="90"/>
+              <w:right w:type="dxa" w:w="130"/>
+            </w:tcMar>
+          </w:tcPr>
+          <w:p>
+            <w:pPr>
+              <w:spacing w:after="0" w:line="270"/>
+            </w:pPr>
+            <w:r>
+              <w:rPr>
+                <w:rFonts w:ascii="Arial" w:cs="Arial" w:eastAsia="Arial" w:hAnsi="Arial"/>
+                <w:b w:val="false"/>
+                <w:bCs w:val="false"/>
+                <w:sz w:val="18"/>
+                <w:szCs w:val="18"/>
+              </w:rPr>
+              <w:t xml:space="preserve">Lo hace y avisa</w:t>
+            </w:r>
+          </w:p>
+        </w:tc>
+        <w:tc>
+          <w:tcPr>
+            <w:tcW w:type="dxa" w:w="3438"/>
+            <w:tcBorders>
+              <w:top w:val="single" w:color="DCD9D3" w:sz="4"/>
+              <w:left w:val="single" w:color="DCD9D3" w:sz="4"/>
+              <w:bottom w:val="single" w:color="DCD9D3" w:sz="4"/>
+              <w:right w:val="single" w:color="DCD9D3" w:sz="4"/>
+            </w:tcBorders>
+            <w:tcMar>
+              <w:top w:type="dxa" w:w="90"/>
+              <w:left w:type="dxa" w:w="130"/>
+              <w:bottom w:type="dxa" w:w="90"/>
+              <w:right w:type="dxa" w:w="130"/>
+            </w:tcMar>
+          </w:tcPr>
+          <w:p>
+            <w:pPr>
+              <w:spacing w:after="0" w:line="270"/>
+            </w:pPr>
+            <w:r>
+              <w:rPr>
+                <w:rFonts w:ascii="Arial" w:cs="Arial" w:eastAsia="Arial" w:hAnsi="Arial"/>
+                <w:b w:val="false"/>
+                <w:bCs w:val="false"/>
+                <w:sz w:val="18"/>
+                <w:szCs w:val="18"/>
+              </w:rPr>
+              <w:t xml:space="preserve">Transcribir, clasificar temas, armar el diagnóstico previo, proponer ideas.</w:t>
+            </w:r>
+          </w:p>
+        </w:tc>
+        <w:tc>
+          <w:tcPr>
+            <w:tcW w:type="dxa" w:w="2800"/>
+            <w:tcBorders>
+              <w:top w:val="single" w:color="DCD9D3" w:sz="4"/>
+              <w:left w:val="single" w:color="DCD9D3" w:sz="4"/>
+              <w:bottom w:val="single" w:color="DCD9D3" w:sz="4"/>
+              <w:right w:val="single" w:color="DCD9D3" w:sz="4"/>
+            </w:tcBorders>
+            <w:tcMar>
+              <w:top w:type="dxa" w:w="90"/>
+              <w:left w:type="dxa" w:w="130"/>
+              <w:bottom w:type="dxa" w:w="90"/>
+              <w:right w:type="dxa" w:w="130"/>
+            </w:tcMar>
+          </w:tcPr>
+          <w:p>
+            <w:pPr>
+              <w:spacing w:after="0" w:line="270"/>
+            </w:pPr>
+            <w:r>
+              <w:rPr>
+                <w:rFonts w:ascii="Arial" w:cs="Arial" w:eastAsia="Arial" w:hAnsi="Arial"/>
+                <w:b w:val="false"/>
+                <w:bCs w:val="false"/>
+                <w:sz w:val="18"/>
+                <w:szCs w:val="18"/>
+              </w:rPr>
+              <w:t xml:space="preserve">La persona recibe el aviso y puede corregir.</w:t>
+            </w:r>
+          </w:p>
+        </w:tc>
+      </w:tr>
+      <w:tr>
+        <w:trPr>
+          <w:tblHeader w:val="off"/>
+        </w:trPr>
+        <w:tc>
+          <w:tcPr>
+            <w:tcW w:type="dxa" w:w="1100"/>
+            <w:tcBorders>
+              <w:top w:val="single" w:color="DCD9D3" w:sz="4"/>
+              <w:left w:val="single" w:color="DCD9D3" w:sz="4"/>
+              <w:bottom w:val="single" w:color="DCD9D3" w:sz="4"/>
+              <w:right w:val="single" w:color="DCD9D3" w:sz="4"/>
+            </w:tcBorders>
+            <w:tcMar>
+              <w:top w:type="dxa" w:w="90"/>
+              <w:left w:type="dxa" w:w="130"/>
+              <w:bottom w:type="dxa" w:w="90"/>
+              <w:right w:type="dxa" w:w="130"/>
+            </w:tcMar>
+          </w:tcPr>
+          <w:p>
+            <w:pPr>
+              <w:spacing w:after="0" w:line="270"/>
             </w:pPr>
             <w:r>
               <w:rPr>
                 <w:rFonts w:ascii="Arial" w:cs="Arial" w:eastAsia="Arial" w:hAnsi="Arial"/>
                 <w:b/>
                 <w:bCs/>
-                <w:color w:val="FFFFFF"/>
-                <w:sz w:val="19"/>
-                <w:szCs w:val="19"/>
-              </w:rPr>
-              <w:t xml:space="preserve">CTR 4,8 %   ·   Duración media 6:12</w:t>
-            </w:r>
-          </w:p>
-          <w:p>
-            <w:pPr>
-              <w:spacing w:after="40" w:line="260"/>
+                <w:sz w:val="18"/>
+                <w:szCs w:val="18"/>
+              </w:rPr>
+              <w:t xml:space="preserve">Nivel 2</w:t>
+            </w:r>
+          </w:p>
+        </w:tc>
+        <w:tc>
+          <w:tcPr>
+            <w:tcW w:type="dxa" w:w="2300"/>
+            <w:tcBorders>
+              <w:top w:val="single" w:color="DCD9D3" w:sz="4"/>
+              <w:left w:val="single" w:color="DCD9D3" w:sz="4"/>
+              <w:bottom w:val="single" w:color="DCD9D3" w:sz="4"/>
+              <w:right w:val="single" w:color="DCD9D3" w:sz="4"/>
+            </w:tcBorders>
+            <w:tcMar>
+              <w:top w:type="dxa" w:w="90"/>
+              <w:left w:type="dxa" w:w="130"/>
+              <w:bottom w:type="dxa" w:w="90"/>
+              <w:right w:type="dxa" w:w="130"/>
+            </w:tcMar>
+          </w:tcPr>
+          <w:p>
+            <w:pPr>
+              <w:spacing w:after="0" w:line="270"/>
+            </w:pPr>
+            <w:r>
+              <w:rPr>
+                <w:rFonts w:ascii="Arial" w:cs="Arial" w:eastAsia="Arial" w:hAnsi="Arial"/>
+                <w:b w:val="false"/>
+                <w:bCs w:val="false"/>
+                <w:sz w:val="18"/>
+                <w:szCs w:val="18"/>
+              </w:rPr>
+              <w:t xml:space="preserve">Lo prepara y espera el OK</w:t>
+            </w:r>
+          </w:p>
+        </w:tc>
+        <w:tc>
+          <w:tcPr>
+            <w:tcW w:type="dxa" w:w="3438"/>
+            <w:tcBorders>
+              <w:top w:val="single" w:color="DCD9D3" w:sz="4"/>
+              <w:left w:val="single" w:color="DCD9D3" w:sz="4"/>
+              <w:bottom w:val="single" w:color="DCD9D3" w:sz="4"/>
+              <w:right w:val="single" w:color="DCD9D3" w:sz="4"/>
+            </w:tcBorders>
+            <w:tcMar>
+              <w:top w:type="dxa" w:w="90"/>
+              <w:left w:type="dxa" w:w="130"/>
+              <w:bottom w:type="dxa" w:w="90"/>
+              <w:right w:type="dxa" w:w="130"/>
+            </w:tcMar>
+          </w:tcPr>
+          <w:p>
+            <w:pPr>
+              <w:spacing w:after="0" w:line="270"/>
+            </w:pPr>
+            <w:r>
+              <w:rPr>
+                <w:rFonts w:ascii="Arial" w:cs="Arial" w:eastAsia="Arial" w:hAnsi="Arial"/>
+                <w:b w:val="false"/>
+                <w:bCs w:val="false"/>
+                <w:sz w:val="18"/>
+                <w:szCs w:val="18"/>
+              </w:rPr>
+              <w:t xml:space="preserve">Guion, títulos y descripción con la voz del creador; plan del mes; serie propuesta.</w:t>
+            </w:r>
+          </w:p>
+        </w:tc>
+        <w:tc>
+          <w:tcPr>
+            <w:tcW w:type="dxa" w:w="2800"/>
+            <w:tcBorders>
+              <w:top w:val="single" w:color="DCD9D3" w:sz="4"/>
+              <w:left w:val="single" w:color="DCD9D3" w:sz="4"/>
+              <w:bottom w:val="single" w:color="DCD9D3" w:sz="4"/>
+              <w:right w:val="single" w:color="DCD9D3" w:sz="4"/>
+            </w:tcBorders>
+            <w:tcMar>
+              <w:top w:type="dxa" w:w="90"/>
+              <w:left w:type="dxa" w:w="130"/>
+              <w:bottom w:type="dxa" w:w="90"/>
+              <w:right w:type="dxa" w:w="130"/>
+            </w:tcMar>
+          </w:tcPr>
+          <w:p>
+            <w:pPr>
+              <w:spacing w:after="0" w:line="270"/>
+            </w:pPr>
+            <w:r>
+              <w:rPr>
+                <w:rFonts w:ascii="Arial" w:cs="Arial" w:eastAsia="Arial" w:hAnsi="Arial"/>
+                <w:b w:val="false"/>
+                <w:bCs w:val="false"/>
+                <w:sz w:val="18"/>
+                <w:szCs w:val="18"/>
+              </w:rPr>
+              <w:t xml:space="preserve">El creador aprueba, edita o descarta. Decisión táctica.</w:t>
+            </w:r>
+          </w:p>
+        </w:tc>
+      </w:tr>
+      <w:tr>
+        <w:trPr>
+          <w:tblHeader w:val="off"/>
+        </w:trPr>
+        <w:tc>
+          <w:tcPr>
+            <w:tcW w:type="dxa" w:w="1100"/>
+            <w:tcBorders>
+              <w:top w:val="single" w:color="DCD9D3" w:sz="4"/>
+              <w:left w:val="single" w:color="DCD9D3" w:sz="4"/>
+              <w:bottom w:val="single" w:color="DCD9D3" w:sz="4"/>
+              <w:right w:val="single" w:color="DCD9D3" w:sz="4"/>
+            </w:tcBorders>
+            <w:tcMar>
+              <w:top w:type="dxa" w:w="90"/>
+              <w:left w:type="dxa" w:w="130"/>
+              <w:bottom w:type="dxa" w:w="90"/>
+              <w:right w:type="dxa" w:w="130"/>
+            </w:tcMar>
+          </w:tcPr>
+          <w:p>
+            <w:pPr>
+              <w:spacing w:after="0" w:line="270"/>
             </w:pPr>
             <w:r>
               <w:rPr>
                 <w:rFonts w:ascii="Arial" w:cs="Arial" w:eastAsia="Arial" w:hAnsi="Arial"/>
                 <w:b/>
                 <w:bCs/>
-                <w:color w:val="FFFFFF"/>
-                <w:sz w:val="19"/>
-                <w:szCs w:val="19"/>
-              </w:rPr>
-              <w:t xml:space="preserve">Impresiones 1,2 M   ·   Tráfico sugerido 41 %</w:t>
-            </w:r>
-          </w:p>
-          <w:p>
-            <w:pPr>
-              <w:spacing w:after="40" w:line="260"/>
-            </w:pPr>
-            <w:r>
-              <w:rPr>
-                <w:rFonts w:ascii="Arial" w:cs="Arial" w:eastAsia="Arial" w:hAnsi="Arial"/>
-                <w:color w:val="9D9A94"/>
-                <w:sz w:val="15"/>
-                <w:szCs w:val="15"/>
-              </w:rPr>
-              <w:t xml:space="preserve">Con la exportación de Studio. Sin ella, solo vistas, me gusta y comentarios públicos.</w:t>
-            </w:r>
-          </w:p>
-        </w:tc>
-        <w:tc>
-          <w:tcPr>
-            <w:tcW w:type="dxa" w:w="4819"/>
-            <w:tcBorders>
-              <w:top w:val="single" w:color="0E0E0E" w:sz="6"/>
-              <w:left w:val="single" w:color="0E0E0E" w:sz="6"/>
-              <w:bottom w:val="single" w:color="0E0E0E" w:sz="6"/>
-              <w:right w:val="single" w:color="0E0E0E" w:sz="6"/>
-            </w:tcBorders>
-            <w:shd w:fill="1E1E1E" w:color="auto" w:val="clear"/>
-            <w:tcMar>
-              <w:top w:type="dxa" w:w="90"/>
-              <w:left w:type="dxa" w:w="130"/>
-              <w:bottom w:type="dxa" w:w="90"/>
-              <w:right w:type="dxa" w:w="130"/>
-            </w:tcMar>
-          </w:tcPr>
-          <w:p>
-            <w:pPr>
-              <w:spacing w:after="70"/>
-            </w:pPr>
-            <w:r>
-              <w:rPr>
-                <w:rFonts w:ascii="Arial" w:cs="Arial" w:eastAsia="Arial" w:hAnsi="Arial"/>
-                <w:b/>
-                <w:bCs/>
-                <w:color w:val="B5B2AC"/>
-                <w:spacing w:val="20"/>
-                <w:sz w:val="14"/>
-                <w:szCs w:val="14"/>
-              </w:rPr>
-              <w:t xml:space="preserve">DE SUS CONTENIDOS</w:t>
-            </w:r>
-            <w:r>
-              <w:rPr>
-                <w:rFonts w:ascii="Arial" w:cs="Arial" w:eastAsia="Arial" w:hAnsi="Arial"/>
-                <w:color w:val="8D8A84"/>
-                <w:sz w:val="14"/>
-                <w:szCs w:val="14"/>
-              </w:rPr>
-              <w:t xml:space="preserve">  · lo que agrega la plataforma</w:t>
-            </w:r>
-          </w:p>
-          <w:p>
-            <w:pPr>
-              <w:spacing w:after="40" w:line="260"/>
-            </w:pPr>
-            <w:r>
-              <w:rPr>
-                <w:rFonts w:ascii="Arial" w:cs="Arial" w:eastAsia="Arial" w:hAnsi="Arial"/>
-                <w:color w:val="D8D5CF"/>
-                <w:sz w:val="17"/>
-                <w:szCs w:val="17"/>
-              </w:rPr>
-              <w:t xml:space="preserve">Fe y trabajo: 31 videos</w:t>
-            </w:r>
-          </w:p>
-          <w:p>
-            <w:pPr>
-              <w:spacing w:after="40" w:line="260"/>
-            </w:pPr>
-            <w:r>
-              <w:rPr>
-                <w:rFonts w:ascii="Arial" w:cs="Arial" w:eastAsia="Arial" w:hAnsi="Arial"/>
-                <w:color w:val="D8D5CF"/>
-                <w:sz w:val="17"/>
-                <w:szCs w:val="17"/>
-              </w:rPr>
-              <w:t xml:space="preserve">Familia: 24</w:t>
-            </w:r>
-          </w:p>
-          <w:p>
-            <w:pPr>
-              <w:spacing w:after="40" w:line="260"/>
-            </w:pPr>
-            <w:r>
-              <w:rPr>
-                <w:rFonts w:ascii="Arial" w:cs="Arial" w:eastAsia="Arial" w:hAnsi="Arial"/>
-                <w:color w:val="D8D5CF"/>
-                <w:sz w:val="17"/>
-                <w:szCs w:val="17"/>
-              </w:rPr>
-              <w:t xml:space="preserve">Finanzas: 9</w:t>
-            </w:r>
-          </w:p>
-          <w:p>
-            <w:pPr>
-              <w:spacing w:after="40" w:line="260"/>
-            </w:pPr>
-            <w:r>
-              <w:rPr>
-                <w:rFonts w:ascii="Arial" w:cs="Arial" w:eastAsia="Arial" w:hAnsi="Arial"/>
-                <w:color w:val="F7898E"/>
-                <w:sz w:val="17"/>
-                <w:szCs w:val="17"/>
-              </w:rPr>
-              <w:t xml:space="preserve">Salud emocional: 2  (casi no lo toca)</w:t>
-            </w:r>
-          </w:p>
-          <w:p>
-            <w:pPr>
-              <w:spacing w:after="40" w:line="260"/>
-            </w:pPr>
-            <w:r>
-              <w:rPr>
-                <w:rFonts w:ascii="Arial" w:cs="Arial" w:eastAsia="Arial" w:hAnsi="Arial"/>
-                <w:color w:val="9D9A94"/>
-                <w:sz w:val="15"/>
-                <w:szCs w:val="15"/>
-              </w:rPr>
-              <w:t xml:space="preserve">Videos por tema, de lo que realmente dijo.</w:t>
-            </w:r>
-          </w:p>
-        </w:tc>
-      </w:tr>
-      <w:tr>
-        <w:tc>
-          <w:tcPr>
-            <w:tcW w:type="dxa" w:w="9638"/>
-            <w:gridSpan w:val="2"/>
-            <w:tcBorders>
-              <w:top w:val="single" w:color="0E0E0E" w:sz="6"/>
-              <w:left w:val="single" w:color="0E0E0E" w:sz="6"/>
-              <w:bottom w:val="single" w:color="0E0E0E" w:sz="6"/>
-              <w:right w:val="single" w:color="0E0E0E" w:sz="6"/>
-            </w:tcBorders>
-            <w:shd w:fill="1E1E1E" w:color="auto" w:val="clear"/>
-            <w:tcMar>
-              <w:top w:type="dxa" w:w="90"/>
-              <w:left w:type="dxa" w:w="130"/>
-              <w:bottom w:type="dxa" w:w="90"/>
-              <w:right w:type="dxa" w:w="130"/>
-            </w:tcMar>
-          </w:tcPr>
-          <w:p>
-            <w:pPr>
-              <w:spacing w:after="70"/>
-            </w:pPr>
-            <w:r>
-              <w:rPr>
-                <w:rFonts w:ascii="Arial" w:cs="Arial" w:eastAsia="Arial" w:hAnsi="Arial"/>
-                <w:b/>
-                <w:bCs/>
-                <w:color w:val="B5B2AC"/>
-                <w:spacing w:val="20"/>
-                <w:sz w:val="14"/>
-                <w:szCs w:val="14"/>
-              </w:rPr>
-              <w:t xml:space="preserve">EL CRUCE</w:t>
-            </w:r>
-            <w:r>
-              <w:rPr>
-                <w:rFonts w:ascii="Arial" w:cs="Arial" w:eastAsia="Arial" w:hAnsi="Arial"/>
-                <w:color w:val="8D8A84"/>
-                <w:sz w:val="14"/>
-                <w:szCs w:val="14"/>
-              </w:rPr>
-              <w:t xml:space="preserve">  · conocimiento × rendimiento</w:t>
-            </w:r>
-          </w:p>
-          <w:tbl>
-            <w:tblPr>
-              <w:tblW w:type="dxa" w:w="9338"/>
-              <w:tblBorders>
-                <w:top w:val="single" w:color="auto" w:sz="4"/>
-                <w:left w:val="single" w:color="auto" w:sz="4"/>
-                <w:bottom w:val="single" w:color="auto" w:sz="4"/>
-                <w:right w:val="single" w:color="auto" w:sz="4"/>
-                <w:insideH w:val="single" w:color="auto" w:sz="4"/>
-                <w:insideV w:val="single" w:color="auto" w:sz="4"/>
-              </w:tblBorders>
-            </w:tblPr>
-            <w:tblGrid>
-              <w:gridCol w:w="1700"/>
-              <w:gridCol w:w="1500"/>
-              <w:gridCol w:w="900"/>
-              <w:gridCol w:w="5238"/>
-            </w:tblGrid>
-            <w:tr>
-              <w:tc>
-                <w:tcPr>
-                  <w:tcW w:type="dxa" w:w="1700"/>
-                  <w:tcBorders>
-                    <w:top w:val="none" w:color="FFFFFF" w:sz="0"/>
-                    <w:left w:val="none" w:color="FFFFFF" w:sz="0"/>
-                    <w:bottom w:val="single" w:color="333333" w:sz="4"/>
-                    <w:right w:val="none" w:color="FFFFFF" w:sz="0"/>
-                  </w:tcBorders>
-                  <w:tcMar>
-                    <w:top w:type="dxa" w:w="50"/>
-                    <w:left w:type="dxa" w:w="0"/>
-                    <w:bottom w:type="dxa" w:w="50"/>
-                    <w:right w:type="dxa" w:w="80"/>
-                  </w:tcMar>
-                </w:tcPr>
-                <w:p>
-                  <w:pPr>
-                    <w:spacing w:after="0" w:line="260"/>
-                  </w:pPr>
-                  <w:r>
-                    <w:rPr>
-                      <w:rFonts w:ascii="Arial" w:cs="Arial" w:eastAsia="Arial" w:hAnsi="Arial"/>
-                      <w:b/>
-                      <w:bCs/>
-                      <w:color w:val="8D8A84"/>
-                      <w:sz w:val="16"/>
-                      <w:szCs w:val="16"/>
-                    </w:rPr>
-                    <w:t xml:space="preserve">Tema</w:t>
-                  </w:r>
-                </w:p>
-              </w:tc>
-              <w:tc>
-                <w:tcPr>
-                  <w:tcW w:type="dxa" w:w="1500"/>
-                  <w:tcBorders>
-                    <w:top w:val="none" w:color="FFFFFF" w:sz="0"/>
-                    <w:left w:val="none" w:color="FFFFFF" w:sz="0"/>
-                    <w:bottom w:val="single" w:color="333333" w:sz="4"/>
-                    <w:right w:val="none" w:color="FFFFFF" w:sz="0"/>
-                  </w:tcBorders>
-                  <w:tcMar>
-                    <w:top w:type="dxa" w:w="50"/>
-                    <w:left w:type="dxa" w:w="0"/>
-                    <w:bottom w:type="dxa" w:w="50"/>
-                    <w:right w:type="dxa" w:w="80"/>
-                  </w:tcMar>
-                </w:tcPr>
-                <w:p>
-                  <w:pPr>
-                    <w:spacing w:after="0" w:line="260"/>
-                  </w:pPr>
-                  <w:r>
-                    <w:rPr>
-                      <w:rFonts w:ascii="Arial" w:cs="Arial" w:eastAsia="Arial" w:hAnsi="Arial"/>
-                      <w:b/>
-                      <w:bCs/>
-                      <w:color w:val="8D8A84"/>
-                      <w:sz w:val="16"/>
-                      <w:szCs w:val="16"/>
-                    </w:rPr>
-                    <w:t xml:space="preserve">Retención media</w:t>
-                  </w:r>
-                </w:p>
-              </w:tc>
-              <w:tc>
-                <w:tcPr>
-                  <w:tcW w:type="dxa" w:w="900"/>
-                  <w:tcBorders>
-                    <w:top w:val="none" w:color="FFFFFF" w:sz="0"/>
-                    <w:left w:val="none" w:color="FFFFFF" w:sz="0"/>
-                    <w:bottom w:val="single" w:color="333333" w:sz="4"/>
-                    <w:right w:val="none" w:color="FFFFFF" w:sz="0"/>
-                  </w:tcBorders>
-                  <w:tcMar>
-                    <w:top w:type="dxa" w:w="50"/>
-                    <w:left w:type="dxa" w:w="0"/>
-                    <w:bottom w:type="dxa" w:w="50"/>
-                    <w:right w:type="dxa" w:w="80"/>
-                  </w:tcMar>
-                </w:tcPr>
-                <w:p>
-                  <w:pPr>
-                    <w:spacing w:after="0" w:line="260"/>
-                  </w:pPr>
-                  <w:r>
-                    <w:rPr>
-                      <w:rFonts w:ascii="Arial" w:cs="Arial" w:eastAsia="Arial" w:hAnsi="Arial"/>
-                      <w:b/>
-                      <w:bCs/>
-                      <w:color w:val="8D8A84"/>
-                      <w:sz w:val="16"/>
-                      <w:szCs w:val="16"/>
-                    </w:rPr>
-                    <w:t xml:space="preserve">CTR</w:t>
-                  </w:r>
-                </w:p>
-              </w:tc>
-              <w:tc>
-                <w:tcPr>
-                  <w:tcW w:type="dxa" w:w="5238"/>
-                  <w:tcBorders>
-                    <w:top w:val="none" w:color="FFFFFF" w:sz="0"/>
-                    <w:left w:val="none" w:color="FFFFFF" w:sz="0"/>
-                    <w:bottom w:val="single" w:color="333333" w:sz="4"/>
-                    <w:right w:val="none" w:color="FFFFFF" w:sz="0"/>
-                  </w:tcBorders>
-                  <w:tcMar>
-                    <w:top w:type="dxa" w:w="50"/>
-                    <w:left w:type="dxa" w:w="0"/>
-                    <w:bottom w:type="dxa" w:w="50"/>
-                    <w:right w:type="dxa" w:w="80"/>
-                  </w:tcMar>
-                </w:tcPr>
-                <w:p>
-                  <w:pPr>
-                    <w:spacing w:after="0" w:line="260"/>
-                  </w:pPr>
-                  <w:r>
-                    <w:rPr>
-                      <w:rFonts w:ascii="Arial" w:cs="Arial" w:eastAsia="Arial" w:hAnsi="Arial"/>
-                      <w:b/>
-                      <w:bCs/>
-                      <w:color w:val="8D8A84"/>
-                      <w:sz w:val="16"/>
-                      <w:szCs w:val="16"/>
-                    </w:rPr>
-                    <w:t xml:space="preserve">Lectura</w:t>
-                  </w:r>
-                </w:p>
-              </w:tc>
-            </w:tr>
-            <w:tr>
-              <w:tc>
-                <w:tcPr>
-                  <w:tcW w:type="dxa" w:w="1700"/>
-                  <w:tcBorders>
-                    <w:top w:val="none" w:color="FFFFFF" w:sz="0"/>
-                    <w:left w:val="none" w:color="FFFFFF" w:sz="0"/>
-                    <w:bottom w:val="single" w:color="333333" w:sz="4"/>
-                    <w:right w:val="none" w:color="FFFFFF" w:sz="0"/>
-                  </w:tcBorders>
-                  <w:tcMar>
-                    <w:top w:type="dxa" w:w="50"/>
-                    <w:left w:type="dxa" w:w="0"/>
-                    <w:bottom w:type="dxa" w:w="50"/>
-                    <w:right w:type="dxa" w:w="80"/>
-                  </w:tcMar>
-                </w:tcPr>
-                <w:p>
-                  <w:pPr>
-                    <w:spacing w:after="0" w:line="260"/>
-                  </w:pPr>
-                  <w:r>
-                    <w:rPr>
-                      <w:rFonts w:ascii="Arial" w:cs="Arial" w:eastAsia="Arial" w:hAnsi="Arial"/>
-                      <w:b/>
-                      <w:bCs/>
-                      <w:color w:val="D8D5CF"/>
-                      <w:sz w:val="16"/>
-                      <w:szCs w:val="16"/>
-                    </w:rPr>
-                    <w:t xml:space="preserve">Fe y trabajo</w:t>
-                  </w:r>
-                </w:p>
-              </w:tc>
-              <w:tc>
-                <w:tcPr>
-                  <w:tcW w:type="dxa" w:w="1500"/>
-                  <w:tcBorders>
-                    <w:top w:val="none" w:color="FFFFFF" w:sz="0"/>
-                    <w:left w:val="none" w:color="FFFFFF" w:sz="0"/>
-                    <w:bottom w:val="single" w:color="333333" w:sz="4"/>
-                    <w:right w:val="none" w:color="FFFFFF" w:sz="0"/>
-                  </w:tcBorders>
-                  <w:tcMar>
-                    <w:top w:type="dxa" w:w="50"/>
-                    <w:left w:type="dxa" w:w="0"/>
-                    <w:bottom w:type="dxa" w:w="50"/>
-                    <w:right w:type="dxa" w:w="80"/>
-                  </w:tcMar>
-                </w:tcPr>
-                <w:p>
-                  <w:pPr>
-                    <w:spacing w:after="0" w:line="260"/>
-                  </w:pPr>
-                  <w:r>
-                    <w:rPr>
-                      <w:rFonts w:ascii="Arial" w:cs="Arial" w:eastAsia="Arial" w:hAnsi="Arial"/>
-                      <w:b w:val="false"/>
-                      <w:bCs w:val="false"/>
-                      <w:color w:val="D8D5CF"/>
-                      <w:sz w:val="16"/>
-                      <w:szCs w:val="16"/>
-                    </w:rPr>
-                    <w:t xml:space="preserve">52 %</w:t>
-                  </w:r>
-                </w:p>
-              </w:tc>
-              <w:tc>
-                <w:tcPr>
-                  <w:tcW w:type="dxa" w:w="900"/>
-                  <w:tcBorders>
-                    <w:top w:val="none" w:color="FFFFFF" w:sz="0"/>
-                    <w:left w:val="none" w:color="FFFFFF" w:sz="0"/>
-                    <w:bottom w:val="single" w:color="333333" w:sz="4"/>
-                    <w:right w:val="none" w:color="FFFFFF" w:sz="0"/>
-                  </w:tcBorders>
-                  <w:tcMar>
-                    <w:top w:type="dxa" w:w="50"/>
-                    <w:left w:type="dxa" w:w="0"/>
-                    <w:bottom w:type="dxa" w:w="50"/>
-                    <w:right w:type="dxa" w:w="80"/>
-                  </w:tcMar>
-                </w:tcPr>
-                <w:p>
-                  <w:pPr>
-                    <w:spacing w:after="0" w:line="260"/>
-                  </w:pPr>
-                  <w:r>
-                    <w:rPr>
-                      <w:rFonts w:ascii="Arial" w:cs="Arial" w:eastAsia="Arial" w:hAnsi="Arial"/>
-                      <w:b w:val="false"/>
-                      <w:bCs w:val="false"/>
-                      <w:color w:val="D8D5CF"/>
-                      <w:sz w:val="16"/>
-                      <w:szCs w:val="16"/>
-                    </w:rPr>
-                    <w:t xml:space="preserve">4,6 %</w:t>
-                  </w:r>
-                </w:p>
-              </w:tc>
-              <w:tc>
-                <w:tcPr>
-                  <w:tcW w:type="dxa" w:w="5238"/>
-                  <w:tcBorders>
-                    <w:top w:val="none" w:color="FFFFFF" w:sz="0"/>
-                    <w:left w:val="none" w:color="FFFFFF" w:sz="0"/>
-                    <w:bottom w:val="single" w:color="333333" w:sz="4"/>
-                    <w:right w:val="none" w:color="FFFFFF" w:sz="0"/>
-                  </w:tcBorders>
-                  <w:tcMar>
-                    <w:top w:type="dxa" w:w="50"/>
-                    <w:left w:type="dxa" w:w="0"/>
-                    <w:bottom w:type="dxa" w:w="50"/>
-                    <w:right w:type="dxa" w:w="80"/>
-                  </w:tcMar>
-                </w:tcPr>
-                <w:p>
-                  <w:pPr>
-                    <w:spacing w:after="0" w:line="260"/>
-                  </w:pPr>
-                  <w:r>
-                    <w:rPr>
-                      <w:rFonts w:ascii="Arial" w:cs="Arial" w:eastAsia="Arial" w:hAnsi="Arial"/>
-                      <w:b w:val="false"/>
-                      <w:bCs w:val="false"/>
-                      <w:color w:val="D8D5CF"/>
-                      <w:sz w:val="16"/>
-                      <w:szCs w:val="16"/>
-                    </w:rPr>
-                    <w:t xml:space="preserve">Domina y rinde: es su núcleo.</w:t>
-                  </w:r>
-                </w:p>
-              </w:tc>
-            </w:tr>
-            <w:tr>
-              <w:tc>
-                <w:tcPr>
-                  <w:tcW w:type="dxa" w:w="1700"/>
-                  <w:tcBorders>
-                    <w:top w:val="none" w:color="FFFFFF" w:sz="0"/>
-                    <w:left w:val="none" w:color="FFFFFF" w:sz="0"/>
-                    <w:bottom w:val="single" w:color="333333" w:sz="4"/>
-                    <w:right w:val="none" w:color="FFFFFF" w:sz="0"/>
-                  </w:tcBorders>
-                  <w:tcMar>
-                    <w:top w:type="dxa" w:w="50"/>
-                    <w:left w:type="dxa" w:w="0"/>
-                    <w:bottom w:type="dxa" w:w="50"/>
-                    <w:right w:type="dxa" w:w="80"/>
-                  </w:tcMar>
-                </w:tcPr>
-                <w:p>
-                  <w:pPr>
-                    <w:spacing w:after="0" w:line="260"/>
-                  </w:pPr>
-                  <w:r>
-                    <w:rPr>
-                      <w:rFonts w:ascii="Arial" w:cs="Arial" w:eastAsia="Arial" w:hAnsi="Arial"/>
-                      <w:b/>
-                      <w:bCs/>
-                      <w:color w:val="D8D5CF"/>
-                      <w:sz w:val="16"/>
-                      <w:szCs w:val="16"/>
-                    </w:rPr>
-                    <w:t xml:space="preserve">Familia</w:t>
-                  </w:r>
-                </w:p>
-              </w:tc>
-              <w:tc>
-                <w:tcPr>
-                  <w:tcW w:type="dxa" w:w="1500"/>
-                  <w:tcBorders>
-                    <w:top w:val="none" w:color="FFFFFF" w:sz="0"/>
-                    <w:left w:val="none" w:color="FFFFFF" w:sz="0"/>
-                    <w:bottom w:val="single" w:color="333333" w:sz="4"/>
-                    <w:right w:val="none" w:color="FFFFFF" w:sz="0"/>
-                  </w:tcBorders>
-                  <w:tcMar>
-                    <w:top w:type="dxa" w:w="50"/>
-                    <w:left w:type="dxa" w:w="0"/>
-                    <w:bottom w:type="dxa" w:w="50"/>
-                    <w:right w:type="dxa" w:w="80"/>
-                  </w:tcMar>
-                </w:tcPr>
-                <w:p>
-                  <w:pPr>
-                    <w:spacing w:after="0" w:line="260"/>
-                  </w:pPr>
-                  <w:r>
-                    <w:rPr>
-                      <w:rFonts w:ascii="Arial" w:cs="Arial" w:eastAsia="Arial" w:hAnsi="Arial"/>
-                      <w:b w:val="false"/>
-                      <w:bCs w:val="false"/>
-                      <w:color w:val="D8D5CF"/>
-                      <w:sz w:val="16"/>
-                      <w:szCs w:val="16"/>
-                    </w:rPr>
-                    <w:t xml:space="preserve">44 %</w:t>
-                  </w:r>
-                </w:p>
-              </w:tc>
-              <w:tc>
-                <w:tcPr>
-                  <w:tcW w:type="dxa" w:w="900"/>
-                  <w:tcBorders>
-                    <w:top w:val="none" w:color="FFFFFF" w:sz="0"/>
-                    <w:left w:val="none" w:color="FFFFFF" w:sz="0"/>
-                    <w:bottom w:val="single" w:color="333333" w:sz="4"/>
-                    <w:right w:val="none" w:color="FFFFFF" w:sz="0"/>
-                  </w:tcBorders>
-                  <w:tcMar>
-                    <w:top w:type="dxa" w:w="50"/>
-                    <w:left w:type="dxa" w:w="0"/>
-                    <w:bottom w:type="dxa" w:w="50"/>
-                    <w:right w:type="dxa" w:w="80"/>
-                  </w:tcMar>
-                </w:tcPr>
-                <w:p>
-                  <w:pPr>
-                    <w:spacing w:after="0" w:line="260"/>
-                  </w:pPr>
-                  <w:r>
-                    <w:rPr>
-                      <w:rFonts w:ascii="Arial" w:cs="Arial" w:eastAsia="Arial" w:hAnsi="Arial"/>
-                      <w:b w:val="false"/>
-                      <w:bCs w:val="false"/>
-                      <w:color w:val="D8D5CF"/>
-                      <w:sz w:val="16"/>
-                      <w:szCs w:val="16"/>
-                    </w:rPr>
-                    <w:t xml:space="preserve">4,1 %</w:t>
-                  </w:r>
-                </w:p>
-              </w:tc>
-              <w:tc>
-                <w:tcPr>
-                  <w:tcW w:type="dxa" w:w="5238"/>
-                  <w:tcBorders>
-                    <w:top w:val="none" w:color="FFFFFF" w:sz="0"/>
-                    <w:left w:val="none" w:color="FFFFFF" w:sz="0"/>
-                    <w:bottom w:val="single" w:color="333333" w:sz="4"/>
-                    <w:right w:val="none" w:color="FFFFFF" w:sz="0"/>
-                  </w:tcBorders>
-                  <w:tcMar>
-                    <w:top w:type="dxa" w:w="50"/>
-                    <w:left w:type="dxa" w:w="0"/>
-                    <w:bottom w:type="dxa" w:w="50"/>
-                    <w:right w:type="dxa" w:w="80"/>
-                  </w:tcMar>
-                </w:tcPr>
-                <w:p>
-                  <w:pPr>
-                    <w:spacing w:after="0" w:line="260"/>
-                  </w:pPr>
-                  <w:r>
-                    <w:rPr>
-                      <w:rFonts w:ascii="Arial" w:cs="Arial" w:eastAsia="Arial" w:hAnsi="Arial"/>
-                      <w:b w:val="false"/>
-                      <w:bCs w:val="false"/>
-                      <w:color w:val="D8D5CF"/>
-                      <w:sz w:val="16"/>
-                      <w:szCs w:val="16"/>
-                    </w:rPr>
-                    <w:t xml:space="preserve">Mucho material, rinde por debajo.</w:t>
-                  </w:r>
-                </w:p>
-              </w:tc>
-            </w:tr>
-            <w:tr>
-              <w:tc>
-                <w:tcPr>
-                  <w:tcW w:type="dxa" w:w="1700"/>
-                  <w:tcBorders>
-                    <w:top w:val="none" w:color="FFFFFF" w:sz="0"/>
-                    <w:left w:val="none" w:color="FFFFFF" w:sz="0"/>
-                    <w:bottom w:val="single" w:color="333333" w:sz="4"/>
-                    <w:right w:val="none" w:color="FFFFFF" w:sz="0"/>
-                  </w:tcBorders>
-                  <w:tcMar>
-                    <w:top w:type="dxa" w:w="50"/>
-                    <w:left w:type="dxa" w:w="0"/>
-                    <w:bottom w:type="dxa" w:w="50"/>
-                    <w:right w:type="dxa" w:w="80"/>
-                  </w:tcMar>
-                </w:tcPr>
-                <w:p>
-                  <w:pPr>
-                    <w:spacing w:after="0" w:line="260"/>
-                  </w:pPr>
-                  <w:r>
-                    <w:rPr>
-                      <w:rFonts w:ascii="Arial" w:cs="Arial" w:eastAsia="Arial" w:hAnsi="Arial"/>
-                      <w:b/>
-                      <w:bCs/>
-                      <w:color w:val="D8D5CF"/>
-                      <w:sz w:val="16"/>
-                      <w:szCs w:val="16"/>
-                    </w:rPr>
-                    <w:t xml:space="preserve">Finanzas</w:t>
-                  </w:r>
-                </w:p>
-              </w:tc>
-              <w:tc>
-                <w:tcPr>
-                  <w:tcW w:type="dxa" w:w="1500"/>
-                  <w:tcBorders>
-                    <w:top w:val="none" w:color="FFFFFF" w:sz="0"/>
-                    <w:left w:val="none" w:color="FFFFFF" w:sz="0"/>
-                    <w:bottom w:val="single" w:color="333333" w:sz="4"/>
-                    <w:right w:val="none" w:color="FFFFFF" w:sz="0"/>
-                  </w:tcBorders>
-                  <w:tcMar>
-                    <w:top w:type="dxa" w:w="50"/>
-                    <w:left w:type="dxa" w:w="0"/>
-                    <w:bottom w:type="dxa" w:w="50"/>
-                    <w:right w:type="dxa" w:w="80"/>
-                  </w:tcMar>
-                </w:tcPr>
-                <w:p>
-                  <w:pPr>
-                    <w:spacing w:after="0" w:line="260"/>
-                  </w:pPr>
-                  <w:r>
-                    <w:rPr>
-                      <w:rFonts w:ascii="Arial" w:cs="Arial" w:eastAsia="Arial" w:hAnsi="Arial"/>
-                      <w:b w:val="false"/>
-                      <w:bCs w:val="false"/>
-                      <w:color w:val="D8D5CF"/>
-                      <w:sz w:val="16"/>
-                      <w:szCs w:val="16"/>
-                    </w:rPr>
-                    <w:t xml:space="preserve">63 %</w:t>
-                  </w:r>
-                </w:p>
-              </w:tc>
-              <w:tc>
-                <w:tcPr>
-                  <w:tcW w:type="dxa" w:w="900"/>
-                  <w:tcBorders>
-                    <w:top w:val="none" w:color="FFFFFF" w:sz="0"/>
-                    <w:left w:val="none" w:color="FFFFFF" w:sz="0"/>
-                    <w:bottom w:val="single" w:color="333333" w:sz="4"/>
-                    <w:right w:val="none" w:color="FFFFFF" w:sz="0"/>
-                  </w:tcBorders>
-                  <w:tcMar>
-                    <w:top w:type="dxa" w:w="50"/>
-                    <w:left w:type="dxa" w:w="0"/>
-                    <w:bottom w:type="dxa" w:w="50"/>
-                    <w:right w:type="dxa" w:w="80"/>
-                  </w:tcMar>
-                </w:tcPr>
-                <w:p>
-                  <w:pPr>
-                    <w:spacing w:after="0" w:line="260"/>
-                  </w:pPr>
-                  <w:r>
-                    <w:rPr>
-                      <w:rFonts w:ascii="Arial" w:cs="Arial" w:eastAsia="Arial" w:hAnsi="Arial"/>
-                      <w:b w:val="false"/>
-                      <w:bCs w:val="false"/>
-                      <w:color w:val="D8D5CF"/>
-                      <w:sz w:val="16"/>
-                      <w:szCs w:val="16"/>
-                    </w:rPr>
-                    <w:t xml:space="preserve">6,2 %</w:t>
-                  </w:r>
-                </w:p>
-              </w:tc>
-              <w:tc>
-                <w:tcPr>
-                  <w:tcW w:type="dxa" w:w="5238"/>
-                  <w:tcBorders>
-                    <w:top w:val="none" w:color="FFFFFF" w:sz="0"/>
-                    <w:left w:val="none" w:color="FFFFFF" w:sz="0"/>
-                    <w:bottom w:val="single" w:color="333333" w:sz="4"/>
-                    <w:right w:val="none" w:color="FFFFFF" w:sz="0"/>
-                  </w:tcBorders>
-                  <w:tcMar>
-                    <w:top w:type="dxa" w:w="50"/>
-                    <w:left w:type="dxa" w:w="0"/>
-                    <w:bottom w:type="dxa" w:w="50"/>
-                    <w:right w:type="dxa" w:w="80"/>
-                  </w:tcMar>
-                </w:tcPr>
-                <w:p>
-                  <w:pPr>
-                    <w:spacing w:after="0" w:line="260"/>
-                  </w:pPr>
-                  <w:r>
-                    <w:rPr>
-                      <w:rFonts w:ascii="Arial" w:cs="Arial" w:eastAsia="Arial" w:hAnsi="Arial"/>
-                      <w:b/>
-                      <w:bCs/>
-                      <w:color w:val="FFFFFF"/>
-                      <w:sz w:val="16"/>
-                      <w:szCs w:val="16"/>
-                    </w:rPr>
-                    <w:t xml:space="preserve">Poco publicado y rinde más: oportunidad.</w:t>
-                  </w:r>
-                </w:p>
-              </w:tc>
-            </w:tr>
-            <w:tr>
-              <w:tc>
-                <w:tcPr>
-                  <w:tcW w:type="dxa" w:w="1700"/>
-                  <w:tcBorders>
-                    <w:top w:val="none" w:color="FFFFFF" w:sz="0"/>
-                    <w:left w:val="none" w:color="FFFFFF" w:sz="0"/>
-                    <w:bottom w:val="single" w:color="333333" w:sz="4"/>
-                    <w:right w:val="none" w:color="FFFFFF" w:sz="0"/>
-                  </w:tcBorders>
-                  <w:tcMar>
-                    <w:top w:type="dxa" w:w="50"/>
-                    <w:left w:type="dxa" w:w="0"/>
-                    <w:bottom w:type="dxa" w:w="50"/>
-                    <w:right w:type="dxa" w:w="80"/>
-                  </w:tcMar>
-                </w:tcPr>
-                <w:p>
-                  <w:pPr>
-                    <w:spacing w:after="0" w:line="260"/>
-                  </w:pPr>
-                  <w:r>
-                    <w:rPr>
-                      <w:rFonts w:ascii="Arial" w:cs="Arial" w:eastAsia="Arial" w:hAnsi="Arial"/>
-                      <w:b/>
-                      <w:bCs/>
-                      <w:color w:val="D8D5CF"/>
-                      <w:sz w:val="16"/>
-                      <w:szCs w:val="16"/>
-                    </w:rPr>
-                    <w:t xml:space="preserve">Salud emocional</w:t>
-                  </w:r>
-                </w:p>
-              </w:tc>
-              <w:tc>
-                <w:tcPr>
-                  <w:tcW w:type="dxa" w:w="1500"/>
-                  <w:tcBorders>
-                    <w:top w:val="none" w:color="FFFFFF" w:sz="0"/>
-                    <w:left w:val="none" w:color="FFFFFF" w:sz="0"/>
-                    <w:bottom w:val="single" w:color="333333" w:sz="4"/>
-                    <w:right w:val="none" w:color="FFFFFF" w:sz="0"/>
-                  </w:tcBorders>
-                  <w:tcMar>
-                    <w:top w:type="dxa" w:w="50"/>
-                    <w:left w:type="dxa" w:w="0"/>
-                    <w:bottom w:type="dxa" w:w="50"/>
-                    <w:right w:type="dxa" w:w="80"/>
-                  </w:tcMar>
-                </w:tcPr>
-                <w:p>
-                  <w:pPr>
-                    <w:spacing w:after="0" w:line="260"/>
-                  </w:pPr>
-                  <w:r>
-                    <w:rPr>
-                      <w:rFonts w:ascii="Arial" w:cs="Arial" w:eastAsia="Arial" w:hAnsi="Arial"/>
-                      <w:b w:val="false"/>
-                      <w:bCs w:val="false"/>
-                      <w:color w:val="D8D5CF"/>
-                      <w:sz w:val="16"/>
-                      <w:szCs w:val="16"/>
-                    </w:rPr>
-                    <w:t xml:space="preserve">pocos datos</w:t>
-                  </w:r>
-                </w:p>
-              </w:tc>
-              <w:tc>
-                <w:tcPr>
-                  <w:tcW w:type="dxa" w:w="900"/>
-                  <w:tcBorders>
-                    <w:top w:val="none" w:color="FFFFFF" w:sz="0"/>
-                    <w:left w:val="none" w:color="FFFFFF" w:sz="0"/>
-                    <w:bottom w:val="single" w:color="333333" w:sz="4"/>
-                    <w:right w:val="none" w:color="FFFFFF" w:sz="0"/>
-                  </w:tcBorders>
-                  <w:tcMar>
-                    <w:top w:type="dxa" w:w="50"/>
-                    <w:left w:type="dxa" w:w="0"/>
-                    <w:bottom w:type="dxa" w:w="50"/>
-                    <w:right w:type="dxa" w:w="80"/>
-                  </w:tcMar>
-                </w:tcPr>
-                <w:p>
-                  <w:pPr>
-                    <w:spacing w:after="0" w:line="260"/>
-                  </w:pPr>
-                  <w:r>
-                    <w:rPr>
-                      <w:rFonts w:ascii="Arial" w:cs="Arial" w:eastAsia="Arial" w:hAnsi="Arial"/>
-                      <w:b w:val="false"/>
-                      <w:bCs w:val="false"/>
-                      <w:color w:val="D8D5CF"/>
-                      <w:sz w:val="16"/>
-                      <w:szCs w:val="16"/>
-                    </w:rPr>
-                    <w:t xml:space="preserve">—</w:t>
-                  </w:r>
-                </w:p>
-              </w:tc>
-              <w:tc>
-                <w:tcPr>
-                  <w:tcW w:type="dxa" w:w="5238"/>
-                  <w:tcBorders>
-                    <w:top w:val="none" w:color="FFFFFF" w:sz="0"/>
-                    <w:left w:val="none" w:color="FFFFFF" w:sz="0"/>
-                    <w:bottom w:val="single" w:color="333333" w:sz="4"/>
-                    <w:right w:val="none" w:color="FFFFFF" w:sz="0"/>
-                  </w:tcBorders>
-                  <w:tcMar>
-                    <w:top w:type="dxa" w:w="50"/>
-                    <w:left w:type="dxa" w:w="0"/>
-                    <w:bottom w:type="dxa" w:w="50"/>
-                    <w:right w:type="dxa" w:w="80"/>
-                  </w:tcMar>
-                </w:tcPr>
-                <w:p>
-                  <w:pPr>
-                    <w:spacing w:after="0" w:line="260"/>
-                  </w:pPr>
-                  <w:r>
-                    <w:rPr>
-                      <w:rFonts w:ascii="Arial" w:cs="Arial" w:eastAsia="Arial" w:hAnsi="Arial"/>
-                      <w:b w:val="false"/>
-                      <w:bCs w:val="false"/>
-                      <w:color w:val="D8D5CF"/>
-                      <w:sz w:val="16"/>
-                      <w:szCs w:val="16"/>
-                    </w:rPr>
-                    <w:t xml:space="preserve">En su base, casi sin videos: vacío.</w:t>
-                  </w:r>
-                </w:p>
-              </w:tc>
-            </w:tr>
-          </w:tbl>
-          <w:p/>
-        </w:tc>
-      </w:tr>
-      <w:tr>
-        <w:tc>
-          <w:tcPr>
-            <w:tcW w:type="dxa" w:w="9638"/>
-            <w:gridSpan w:val="2"/>
-            <w:tcBorders>
-              <w:top w:val="single" w:color="0E0E0E" w:sz="6"/>
-              <w:left w:val="single" w:color="0E0E0E" w:sz="6"/>
-              <w:bottom w:val="single" w:color="0E0E0E" w:sz="6"/>
-              <w:right w:val="single" w:color="0E0E0E" w:sz="6"/>
-            </w:tcBorders>
-            <w:shd w:fill="1E1E1E" w:color="auto" w:val="clear"/>
-            <w:tcMar>
-              <w:top w:type="dxa" w:w="90"/>
-              <w:left w:type="dxa" w:w="130"/>
-              <w:bottom w:type="dxa" w:w="90"/>
-              <w:right w:type="dxa" w:w="130"/>
-            </w:tcMar>
-          </w:tcPr>
-          <w:p>
-            <w:pPr>
-              <w:spacing w:after="70"/>
-            </w:pPr>
-            <w:r>
-              <w:rPr>
-                <w:rFonts w:ascii="Arial" w:cs="Arial" w:eastAsia="Arial" w:hAnsi="Arial"/>
-                <w:b/>
-                <w:bCs/>
-                <w:color w:val="B5B2AC"/>
-                <w:spacing w:val="20"/>
-                <w:sz w:val="14"/>
-                <w:szCs w:val="14"/>
-              </w:rPr>
-              <w:t xml:space="preserve">POSTURA Y SIGUIENTE PASO</w:t>
-            </w:r>
-            <w:r>
-              <w:rPr>
-                <w:rFonts w:ascii="Arial" w:cs="Arial" w:eastAsia="Arial" w:hAnsi="Arial"/>
-                <w:color w:val="8D8A84"/>
-                <w:sz w:val="14"/>
-                <w:szCs w:val="14"/>
-              </w:rPr>
-              <w:t xml:space="preserve"/>
-            </w:r>
-          </w:p>
-          <w:p>
-            <w:pPr>
-              <w:spacing w:after="10" w:line="260"/>
-            </w:pPr>
-            <w:r>
-              <w:rPr>
-                <w:rFonts w:ascii="Arial" w:cs="Arial" w:eastAsia="Arial" w:hAnsi="Arial"/>
-                <w:color w:val="FFFFFF"/>
-                <w:sz w:val="17"/>
-                <w:szCs w:val="17"/>
-              </w:rPr>
-              <w:t xml:space="preserve">Finanzas: su postura cambió entre 2021 y 2024, y dos videos se contradicen.</w:t>
-            </w:r>
-          </w:p>
-          <w:p>
-            <w:pPr>
-              <w:spacing w:after="80" w:line="260"/>
-            </w:pPr>
-            <w:r>
-              <w:rPr>
-                <w:rFonts w:ascii="Arial" w:cs="Arial" w:eastAsia="Arial" w:hAnsi="Arial"/>
-                <w:i/>
-                <w:iCs/>
-                <w:color w:val="9D9A94"/>
-                <w:sz w:val="15"/>
-                <w:szCs w:val="15"/>
-              </w:rPr>
-              <w:t xml:space="preserve">Video 57, min. 8:10, y video 164, min. 3:45.   [Revisar con el creador]</w:t>
-            </w:r>
-          </w:p>
-          <w:p>
-            <w:pPr>
-              <w:spacing w:after="10" w:line="260"/>
-            </w:pPr>
-            <w:r>
-              <w:rPr>
-                <w:rFonts w:ascii="Arial" w:cs="Arial" w:eastAsia="Arial" w:hAnsi="Arial"/>
-                <w:color w:val="FFFFFF"/>
-                <w:sz w:val="17"/>
-                <w:szCs w:val="17"/>
-              </w:rPr>
-              <w:t xml:space="preserve">Serie propuesta: tres videos sobre Finanzas, con sus propias palabras y el formato que ya le funcionó.</w:t>
-            </w:r>
-          </w:p>
-          <w:p>
-            <w:pPr>
-              <w:spacing w:after="0" w:line="260"/>
-            </w:pPr>
-            <w:r>
-              <w:rPr>
-                <w:rFonts w:ascii="Arial" w:cs="Arial" w:eastAsia="Arial" w:hAnsi="Arial"/>
-                <w:i/>
-                <w:iCs/>
-                <w:color w:val="9D9A94"/>
-                <w:sz w:val="15"/>
-                <w:szCs w:val="15"/>
-              </w:rPr>
-              <w:t xml:space="preserve">Fuentes: videos 57, 164 y 171.   [Pasar al plan]</w:t>
+                <w:sz w:val="18"/>
+                <w:szCs w:val="18"/>
+              </w:rPr>
+              <w:t xml:space="preserve">Nivel 3</w:t>
+            </w:r>
+          </w:p>
+        </w:tc>
+        <w:tc>
+          <w:tcPr>
+            <w:tcW w:type="dxa" w:w="2300"/>
+            <w:tcBorders>
+              <w:top w:val="single" w:color="DCD9D3" w:sz="4"/>
+              <w:left w:val="single" w:color="DCD9D3" w:sz="4"/>
+              <w:bottom w:val="single" w:color="DCD9D3" w:sz="4"/>
+              <w:right w:val="single" w:color="DCD9D3" w:sz="4"/>
+            </w:tcBorders>
+            <w:tcMar>
+              <w:top w:type="dxa" w:w="90"/>
+              <w:left w:type="dxa" w:w="130"/>
+              <w:bottom w:type="dxa" w:w="90"/>
+              <w:right w:type="dxa" w:w="130"/>
+            </w:tcMar>
+          </w:tcPr>
+          <w:p>
+            <w:pPr>
+              <w:spacing w:after="0" w:line="270"/>
+            </w:pPr>
+            <w:r>
+              <w:rPr>
+                <w:rFonts w:ascii="Arial" w:cs="Arial" w:eastAsia="Arial" w:hAnsi="Arial"/>
+                <w:b w:val="false"/>
+                <w:bCs w:val="false"/>
+                <w:sz w:val="18"/>
+                <w:szCs w:val="18"/>
+              </w:rPr>
+              <w:t xml:space="preserve">Nunca sola</w:t>
+            </w:r>
+          </w:p>
+        </w:tc>
+        <w:tc>
+          <w:tcPr>
+            <w:tcW w:type="dxa" w:w="3438"/>
+            <w:tcBorders>
+              <w:top w:val="single" w:color="DCD9D3" w:sz="4"/>
+              <w:left w:val="single" w:color="DCD9D3" w:sz="4"/>
+              <w:bottom w:val="single" w:color="DCD9D3" w:sz="4"/>
+              <w:right w:val="single" w:color="DCD9D3" w:sz="4"/>
+            </w:tcBorders>
+            <w:tcMar>
+              <w:top w:type="dxa" w:w="90"/>
+              <w:left w:type="dxa" w:w="130"/>
+              <w:bottom w:type="dxa" w:w="90"/>
+              <w:right w:type="dxa" w:w="130"/>
+            </w:tcMar>
+          </w:tcPr>
+          <w:p>
+            <w:pPr>
+              <w:spacing w:after="0" w:line="270"/>
+            </w:pPr>
+            <w:r>
+              <w:rPr>
+                <w:rFonts w:ascii="Arial" w:cs="Arial" w:eastAsia="Arial" w:hAnsi="Arial"/>
+                <w:b w:val="false"/>
+                <w:bCs w:val="false"/>
+                <w:sz w:val="18"/>
+                <w:szCs w:val="18"/>
+              </w:rPr>
+              <w:t xml:space="preserve">Cambiar la dirección del canal, abrir o cerrar formatos, lanzar una serie, publicar, cualquier compromiso, precio o plazo.</w:t>
+            </w:r>
+          </w:p>
+        </w:tc>
+        <w:tc>
+          <w:tcPr>
+            <w:tcW w:type="dxa" w:w="2800"/>
+            <w:tcBorders>
+              <w:top w:val="single" w:color="DCD9D3" w:sz="4"/>
+              <w:left w:val="single" w:color="DCD9D3" w:sz="4"/>
+              <w:bottom w:val="single" w:color="DCD9D3" w:sz="4"/>
+              <w:right w:val="single" w:color="DCD9D3" w:sz="4"/>
+            </w:tcBorders>
+            <w:tcMar>
+              <w:top w:type="dxa" w:w="90"/>
+              <w:left w:type="dxa" w:w="130"/>
+              <w:bottom w:type="dxa" w:w="90"/>
+              <w:right w:type="dxa" w:w="130"/>
+            </w:tcMar>
+          </w:tcPr>
+          <w:p>
+            <w:pPr>
+              <w:spacing w:after="0" w:line="270"/>
+            </w:pPr>
+            <w:r>
+              <w:rPr>
+                <w:rFonts w:ascii="Arial" w:cs="Arial" w:eastAsia="Arial" w:hAnsi="Arial"/>
+                <w:b w:val="false"/>
+                <w:bCs w:val="false"/>
+                <w:sz w:val="18"/>
+                <w:szCs w:val="18"/>
+              </w:rPr>
+              <w:t xml:space="preserve">La estratega, con el creador. Decisión estratégica.</w:t>
             </w:r>
           </w:p>
         </w:tc>
@@ -1807,16 +1543,205 @@
           <w:sz w:val="18"/>
           <w:szCs w:val="18"/>
         </w:rPr>
-        <w:t xml:space="preserve">Pantalla ilustrativa con datos ficticios. En la plataforma, cada afirmación abre el video en el minuto citado.</w:t>
+        <w:t xml:space="preserve">Cada decisión queda registrada: quién la tomó, cuándo y con qué evidencia. Así se puede revisar después qué se decidió y qué resultado dio.</w:t>
       </w:r>
     </w:p>
     <w:p>
       <w:pPr>
         <w:keepNext/>
+        <w:pageBreakBefore/>
         <w:pBdr>
           <w:top w:val="single" w:color="1D1D1D" w:sz="12" w:space="6"/>
         </w:pBdr>
-        <w:spacing w:after="120" w:before="280"/>
+        <w:spacing w:after="120" w:before="0"/>
+      </w:pPr>
+      <w:r>
+        <w:rPr>
+          <w:rFonts w:ascii="Arial" w:cs="Arial" w:eastAsia="Arial" w:hAnsi="Arial"/>
+          <w:b/>
+          <w:bCs/>
+          <w:spacing w:val="40"/>
+          <w:sz w:val="17"/>
+          <w:szCs w:val="17"/>
+        </w:rPr>
+        <w:t xml:space="preserve">PANEL DE LA ESTRATEGA</w:t>
+      </w:r>
+    </w:p>
+    <w:p>
+      <w:pPr>
+        <w:spacing w:after="120" w:line="300"/>
+      </w:pPr>
+      <w:r>
+        <w:rPr>
+          <w:rFonts w:ascii="Arial" w:cs="Arial" w:eastAsia="Arial" w:hAnsi="Arial"/>
+          <w:sz w:val="21"/>
+          <w:szCs w:val="21"/>
+        </w:rPr>
+        <w:t xml:space="preserve">Aquí llega todo lo que la estratega necesita antes de la sesión. Mezcla las métricas de YouTube, que Eloísa ya sabe leer, con métricas del conocimiento implícito en los contenidos: qué temas domina, dónde cambió de postura, qué le falta decir. La novedad es el cruce de las dos.</w:t>
+      </w:r>
+    </w:p>
+    <w:p>
+      <w:pPr>
+        <w:spacing w:after="80" w:before="80"/>
+        <w:jc w:val="center"/>
+      </w:pPr>
+      <w:r>
+        <w:drawing>
+          <wp:inline distT="0" distB="0" distL="0" distR="0">
+            <wp:extent cx="5334000" cy="6838950"/>
+            <wp:effectExtent t="0" r="0" b="0" l="0"/>
+            <wp:docPr id="2" name="img_estratega.png" descr="img_estratega.png" title="img_estratega.png"/>
+            <wp:cNvGraphicFramePr>
+              <a:graphicFrameLocks xmlns:a="http://schemas.openxmlformats.org/drawingml/2006/main" noChangeAspect="1"/>
+            </wp:cNvGraphicFramePr>
+            <a:graphic xmlns:a="http://schemas.openxmlformats.org/drawingml/2006/main">
+              <a:graphicData uri="http://schemas.openxmlformats.org/drawingml/2006/picture">
+                <pic:pic xmlns:pic="http://schemas.openxmlformats.org/drawingml/2006/picture">
+                  <pic:nvPicPr>
+                    <pic:cNvPr id="0" name="" descr=""/>
+                    <pic:cNvPicPr>
+                      <a:picLocks noChangeAspect="1" noChangeArrowheads="1"/>
+                    </pic:cNvPicPr>
+                  </pic:nvPicPr>
+                  <pic:blipFill>
+                    <a:blip r:embed="rId9" cstate="none"/>
+                    <a:srcRect/>
+                    <a:stretch>
+                      <a:fillRect/>
+                    </a:stretch>
+                  </pic:blipFill>
+                  <pic:spPr bwMode="auto">
+                    <a:xfrm>
+                      <a:off x="0" y="0"/>
+                      <a:ext cx="5334000" cy="6838950"/>
+                    </a:xfrm>
+                    <a:prstGeom prst="rect">
+                      <a:avLst/>
+                    </a:prstGeom>
+                  </pic:spPr>
+                </pic:pic>
+              </a:graphicData>
+            </a:graphic>
+          </wp:inline>
+        </w:drawing>
+      </w:r>
+    </w:p>
+    <w:p>
+      <w:pPr>
+        <w:spacing w:after="120" w:line="300"/>
+      </w:pPr>
+      <w:r>
+        <w:rPr>
+          <w:rFonts w:ascii="Arial" w:cs="Arial" w:eastAsia="Arial" w:hAnsi="Arial"/>
+          <w:color w:val="5A5752"/>
+          <w:sz w:val="18"/>
+          <w:szCs w:val="18"/>
+        </w:rPr>
+        <w:t xml:space="preserve">Pantalla ilustrativa con datos ficticios. Cada afirmación de la plataforma abre el video en el minuto citado.</w:t>
+      </w:r>
+    </w:p>
+    <w:p>
+      <w:pPr>
+        <w:keepNext/>
+        <w:pageBreakBefore/>
+        <w:pBdr>
+          <w:top w:val="single" w:color="1D1D1D" w:sz="12" w:space="6"/>
+        </w:pBdr>
+        <w:spacing w:after="120" w:before="0"/>
+      </w:pPr>
+      <w:r>
+        <w:rPr>
+          <w:rFonts w:ascii="Arial" w:cs="Arial" w:eastAsia="Arial" w:hAnsi="Arial"/>
+          <w:b/>
+          <w:bCs/>
+          <w:spacing w:val="40"/>
+          <w:sz w:val="17"/>
+          <w:szCs w:val="17"/>
+        </w:rPr>
+        <w:t xml:space="preserve">PANEL DEL CREADOR</w:t>
+      </w:r>
+    </w:p>
+    <w:p>
+      <w:pPr>
+        <w:spacing w:after="120" w:line="300"/>
+      </w:pPr>
+      <w:r>
+        <w:rPr>
+          <w:rFonts w:ascii="Arial" w:cs="Arial" w:eastAsia="Arial" w:hAnsi="Arial"/>
+          <w:sz w:val="21"/>
+          <w:szCs w:val="21"/>
+        </w:rPr>
+        <w:t xml:space="preserve">El creador ve su propia base de conocimiento, no la del resto, y decide sobre su contenido con base en lo que él mismo ha dicho. Las reglas y los conceptos de Eloísa se aplican a cada propuesta antes de que llegue a sus manos.</w:t>
+      </w:r>
+    </w:p>
+    <w:p>
+      <w:pPr>
+        <w:spacing w:after="80" w:before="80"/>
+        <w:jc w:val="center"/>
+      </w:pPr>
+      <w:r>
+        <w:drawing>
+          <wp:inline distT="0" distB="0" distL="0" distR="0">
+            <wp:extent cx="5905500" cy="5629275"/>
+            <wp:effectExtent t="0" r="0" b="0" l="0"/>
+            <wp:docPr id="3" name="img_creador.png" descr="img_creador.png" title="img_creador.png"/>
+            <wp:cNvGraphicFramePr>
+              <a:graphicFrameLocks xmlns:a="http://schemas.openxmlformats.org/drawingml/2006/main" noChangeAspect="1"/>
+            </wp:cNvGraphicFramePr>
+            <a:graphic xmlns:a="http://schemas.openxmlformats.org/drawingml/2006/main">
+              <a:graphicData uri="http://schemas.openxmlformats.org/drawingml/2006/picture">
+                <pic:pic xmlns:pic="http://schemas.openxmlformats.org/drawingml/2006/picture">
+                  <pic:nvPicPr>
+                    <pic:cNvPr id="0" name="" descr=""/>
+                    <pic:cNvPicPr>
+                      <a:picLocks noChangeAspect="1" noChangeArrowheads="1"/>
+                    </pic:cNvPicPr>
+                  </pic:nvPicPr>
+                  <pic:blipFill>
+                    <a:blip r:embed="rId10" cstate="none"/>
+                    <a:srcRect/>
+                    <a:stretch>
+                      <a:fillRect/>
+                    </a:stretch>
+                  </pic:blipFill>
+                  <pic:spPr bwMode="auto">
+                    <a:xfrm>
+                      <a:off x="0" y="0"/>
+                      <a:ext cx="5905500" cy="5629275"/>
+                    </a:xfrm>
+                    <a:prstGeom prst="rect">
+                      <a:avLst/>
+                    </a:prstGeom>
+                  </pic:spPr>
+                </pic:pic>
+              </a:graphicData>
+            </a:graphic>
+          </wp:inline>
+        </w:drawing>
+      </w:r>
+    </w:p>
+    <w:p>
+      <w:pPr>
+        <w:spacing w:after="120" w:line="300"/>
+      </w:pPr>
+      <w:r>
+        <w:rPr>
+          <w:rFonts w:ascii="Arial" w:cs="Arial" w:eastAsia="Arial" w:hAnsi="Arial"/>
+          <w:color w:val="5A5752"/>
+          <w:sz w:val="18"/>
+          <w:szCs w:val="18"/>
+        </w:rPr>
+        <w:t xml:space="preserve">Pantalla ilustrativa con datos y citas ficticios. En la plataforma, cada cita abre el video en el minuto indicado.</w:t>
+      </w:r>
+    </w:p>
+    <w:p>
+      <w:pPr>
+        <w:keepNext/>
+        <w:pageBreakBefore/>
+        <w:pBdr>
+          <w:top w:val="single" w:color="1D1D1D" w:sz="12" w:space="6"/>
+        </w:pBdr>
+        <w:spacing w:after="120" w:before="0"/>
       </w:pPr>
       <w:r>
         <w:rPr>
@@ -2044,7 +1969,7 @@
                 <w:sz w:val="18"/>
                 <w:szCs w:val="18"/>
               </w:rPr>
-              <w:t xml:space="preserve">• Transcripción automática de todos los videos de un canal nuevo.</w:t>
+              <w:t xml:space="preserve">• El panel de la estratega y el panel del creador, con las reglas y conceptos de Eloísa.</w:t>
             </w:r>
           </w:p>
           <w:p>
@@ -2057,7 +1982,7 @@
                 <w:sz w:val="18"/>
                 <w:szCs w:val="18"/>
               </w:rPr>
-              <w:t xml:space="preserve">• Espacio separado por cliente, para atender varios a la vez.</w:t>
+              <w:t xml:space="preserve">• Transcripción automática de todos los videos de un canal nuevo.</w:t>
             </w:r>
           </w:p>
           <w:p>
@@ -2070,7 +1995,7 @@
                 <w:sz w:val="18"/>
                 <w:szCs w:val="18"/>
               </w:rPr>
-              <w:t xml:space="preserve">• Tablero semanal de propuestas y calendario editorial.</w:t>
+              <w:t xml:space="preserve">• Espacio separado por cliente, para atender varios a la vez.</w:t>
             </w:r>
           </w:p>
           <w:p>
@@ -2083,6 +2008,19 @@
                 <w:sz w:val="18"/>
                 <w:szCs w:val="18"/>
               </w:rPr>
+              <w:t xml:space="preserve">• Tablero semanal de propuestas y calendario editorial.</w:t>
+            </w:r>
+          </w:p>
+          <w:p>
+            <w:pPr>
+              <w:spacing w:after="0" w:line="270"/>
+            </w:pPr>
+            <w:r>
+              <w:rPr>
+                <w:rFonts w:ascii="Arial" w:cs="Arial" w:eastAsia="Arial" w:hAnsi="Arial"/>
+                <w:sz w:val="18"/>
+                <w:szCs w:val="18"/>
+              </w:rPr>
               <w:t xml:space="preserve">• Radar de demanda: qué busca la gente sobre los temas del creador.</w:t>
             </w:r>
           </w:p>
@@ -2092,11 +2030,10 @@
     <w:p>
       <w:pPr>
         <w:keepNext/>
-        <w:pageBreakBefore/>
         <w:pBdr>
           <w:top w:val="single" w:color="1D1D1D" w:sz="12" w:space="6"/>
         </w:pBdr>
-        <w:spacing w:after="120" w:before="0"/>
+        <w:spacing w:after="120" w:before="280"/>
       </w:pPr>
       <w:r>
         <w:rPr>
@@ -2972,6 +2909,24 @@
           <w:szCs w:val="21"/>
         </w:rPr>
         <w:t xml:space="preserve">La plataforma la pongo yo, con mi equipo de inteligencia artificial, y sigue siendo mía. Wolf Digital conserva su relación y su marca con los alumnos.</w:t>
+      </w:r>
+    </w:p>
+    <w:p>
+      <w:pPr>
+        <w:pStyle w:val="ListParagraph"/>
+        <w:numPr>
+          <w:ilvl w:val="0"/>
+          <w:numId w:val="2"/>
+        </w:numPr>
+        <w:spacing w:after="70" w:line="290"/>
+      </w:pPr>
+      <w:r>
+        <w:rPr>
+          <w:rFonts w:ascii="Arial" w:cs="Arial" w:eastAsia="Arial" w:hAnsi="Arial"/>
+          <w:sz w:val="21"/>
+          <w:szCs w:val="21"/>
+        </w:rPr>
+        <w:t xml:space="preserve">Las reglas y los conceptos de Eloísa se cargan en la plataforma y siguen siendo de ella.</w:t>
       </w:r>
     </w:p>
     <w:p>

</xml_diff>

<commit_message>
Propuesta: se quita «Cómo trabajaríamos juntas» y pasa a un punto de los próximos pasos
Co-Authored-By: Claude Sonnet 5.5 <noreply@anthropic.com>
Claude-Session: https://claude.ai/code/session_01Qz2v3pBufXuWxCEeuDhn6M dariocsosa/truthframe@2d18164a130268effb7cb45cdfdfcec3568a6e12
</commit_message>
<xml_diff>
--- a/assets/diana/Diana_Cardona_Propuesta_Operativa.docx
+++ b/assets/diana/Diana_Cardona_Propuesta_Operativa.docx
@@ -2872,7 +2872,7 @@
           <w:sz w:val="17"/>
           <w:szCs w:val="17"/>
         </w:rPr>
-        <w:t xml:space="preserve">CÓMO TRABAJARÍAMOS JUNTAS</w:t>
+        <w:t xml:space="preserve">CÓMO CUIDAMOS LOS DATOS</w:t>
       </w:r>
     </w:p>
     <w:p>
@@ -2890,7 +2890,7 @@
           <w:sz w:val="21"/>
           <w:szCs w:val="21"/>
         </w:rPr>
-        <w:t xml:space="preserve">Yo lideraría este frente dentro de Wolf Digital: el diagnóstico, las sesiones, las clínicas y el seguimiento.</w:t>
+        <w:t xml:space="preserve">Los datos de cada creador son suyos y no se mezclan con los de otro: cada uno tiene su base y su espacio.</w:t>
       </w:r>
     </w:p>
     <w:p>
@@ -2908,7 +2908,7 @@
           <w:sz w:val="21"/>
           <w:szCs w:val="21"/>
         </w:rPr>
-        <w:t xml:space="preserve">La plataforma la pongo yo, con mi equipo de inteligencia artificial, y sigue siendo mía. Wolf Digital conserva su relación y su marca con los alumnos.</w:t>
+        <w:t xml:space="preserve">Nada se publica sin pasar por la aprobación definida, y todo lo que la plataforma dice del creador remite a un video y un minuto.</w:t>
       </w:r>
     </w:p>
     <w:p>
@@ -2926,7 +2926,7 @@
           <w:sz w:val="21"/>
           <w:szCs w:val="21"/>
         </w:rPr>
-        <w:t xml:space="preserve">Las reglas y los conceptos de Eloísa se cargan en la plataforma y siguen siendo de ella.</w:t>
+        <w:t xml:space="preserve">La voz del creador manda: lo que agrega el sistema se marca y se revisa.</w:t>
       </w:r>
     </w:p>
     <w:p>
@@ -2944,7 +2944,7 @@
           <w:sz w:val="21"/>
           <w:szCs w:val="21"/>
         </w:rPr>
-        <w:t xml:space="preserve">Cómo se estructura la colaboración y sus condiciones económicas lo conversamos juntas en la segunda reunión, una vez que veamos los resultados esperados del piloto.</w:t>
+        <w:t xml:space="preserve">El acceso es solo para personas autorizadas, con permisos por perfil.</w:t>
       </w:r>
     </w:p>
     <w:p>
@@ -2964,7 +2964,7 @@
           <w:sz w:val="17"/>
           <w:szCs w:val="17"/>
         </w:rPr>
-        <w:t xml:space="preserve">CÓMO CUIDAMOS LOS DATOS</w:t>
+        <w:t xml:space="preserve">SI TE PARECE BIEN, LOS PRÓXIMOS PASOS</w:t>
       </w:r>
     </w:p>
     <w:p>
@@ -2979,10 +2979,20 @@
       <w:r>
         <w:rPr>
           <w:rFonts w:ascii="Arial" w:cs="Arial" w:eastAsia="Arial" w:hAnsi="Arial"/>
-          <w:sz w:val="21"/>
-          <w:szCs w:val="21"/>
-        </w:rPr>
-        <w:t xml:space="preserve">Los datos de cada creador son suyos y no se mezclan con los de otro: cada uno tiene su base y su espacio.</w:t>
+          <w:b/>
+          <w:bCs/>
+          <w:sz w:val="21"/>
+          <w:szCs w:val="21"/>
+        </w:rPr>
+        <w:t xml:space="preserve">Una segunda reunión</w:t>
+      </w:r>
+      <w:r>
+        <w:rPr>
+          <w:rFonts w:ascii="Arial" w:cs="Arial" w:eastAsia="Arial" w:hAnsi="Arial"/>
+          <w:sz w:val="21"/>
+          <w:szCs w:val="21"/>
+        </w:rPr>
+        <w:t xml:space="preserve"> para ver la plataforma en pantalla y revisar este plan contigo.</w:t>
       </w:r>
     </w:p>
     <w:p>
@@ -2997,10 +3007,20 @@
       <w:r>
         <w:rPr>
           <w:rFonts w:ascii="Arial" w:cs="Arial" w:eastAsia="Arial" w:hAnsi="Arial"/>
-          <w:sz w:val="21"/>
-          <w:szCs w:val="21"/>
-        </w:rPr>
-        <w:t xml:space="preserve">Nada se publica sin pasar por la aprobación definida, y todo lo que la plataforma dice del creador remite a un video y un minuto.</w:t>
+          <w:b/>
+          <w:bCs/>
+          <w:sz w:val="21"/>
+          <w:szCs w:val="21"/>
+        </w:rPr>
+        <w:t xml:space="preserve">Definir el piloto</w:t>
+      </w:r>
+      <w:r>
+        <w:rPr>
+          <w:rFonts w:ascii="Arial" w:cs="Arial" w:eastAsia="Arial" w:hAnsi="Arial"/>
+          <w:sz w:val="21"/>
+          <w:szCs w:val="21"/>
+        </w:rPr>
+        <w:t xml:space="preserve">: las 10 personas, las fechas y qué cuenta como éxito.</w:t>
       </w:r>
     </w:p>
     <w:p>
@@ -3015,10 +3035,20 @@
       <w:r>
         <w:rPr>
           <w:rFonts w:ascii="Arial" w:cs="Arial" w:eastAsia="Arial" w:hAnsi="Arial"/>
-          <w:sz w:val="21"/>
-          <w:szCs w:val="21"/>
-        </w:rPr>
-        <w:t xml:space="preserve">La voz del creador manda: lo que agrega el sistema se marca y se revisa.</w:t>
+          <w:b/>
+          <w:bCs/>
+          <w:sz w:val="21"/>
+          <w:szCs w:val="21"/>
+        </w:rPr>
+        <w:t xml:space="preserve">Preparar el tutorial</w:t>
+      </w:r>
+      <w:r>
+        <w:rPr>
+          <w:rFonts w:ascii="Arial" w:cs="Arial" w:eastAsia="Arial" w:hAnsi="Arial"/>
+          <w:sz w:val="21"/>
+          <w:szCs w:val="21"/>
+        </w:rPr>
+        <w:t xml:space="preserve"> de pre-diagnóstico para que los creadores lleguen listos.</w:t>
       </w:r>
     </w:p>
     <w:p>
@@ -3033,114 +3063,20 @@
       <w:r>
         <w:rPr>
           <w:rFonts w:ascii="Arial" w:cs="Arial" w:eastAsia="Arial" w:hAnsi="Arial"/>
-          <w:sz w:val="21"/>
-          <w:szCs w:val="21"/>
-        </w:rPr>
-        <w:t xml:space="preserve">El acceso es solo para personas autorizadas, con permisos por perfil.</w:t>
-      </w:r>
-    </w:p>
-    <w:p>
-      <w:pPr>
-        <w:keepNext/>
-        <w:pBdr>
-          <w:top w:val="single" w:color="1D1D1D" w:sz="12" w:space="6"/>
-        </w:pBdr>
-        <w:spacing w:after="120" w:before="280"/>
-      </w:pPr>
-      <w:r>
-        <w:rPr>
-          <w:rFonts w:ascii="Arial" w:cs="Arial" w:eastAsia="Arial" w:hAnsi="Arial"/>
           <w:b/>
           <w:bCs/>
-          <w:spacing w:val="40"/>
-          <w:sz w:val="17"/>
-          <w:szCs w:val="17"/>
-        </w:rPr>
-        <w:t xml:space="preserve">SI TE PARECE BIEN, LOS PRÓXIMOS PASOS</w:t>
-      </w:r>
-    </w:p>
-    <w:p>
-      <w:pPr>
-        <w:pStyle w:val="ListParagraph"/>
-        <w:numPr>
-          <w:ilvl w:val="0"/>
-          <w:numId w:val="2"/>
-        </w:numPr>
-        <w:spacing w:after="70" w:line="290"/>
-      </w:pPr>
-      <w:r>
-        <w:rPr>
-          <w:rFonts w:ascii="Arial" w:cs="Arial" w:eastAsia="Arial" w:hAnsi="Arial"/>
-          <w:b/>
-          <w:bCs/>
-          <w:sz w:val="21"/>
-          <w:szCs w:val="21"/>
-        </w:rPr>
-        <w:t xml:space="preserve">Una segunda reunión</w:t>
-      </w:r>
-      <w:r>
-        <w:rPr>
-          <w:rFonts w:ascii="Arial" w:cs="Arial" w:eastAsia="Arial" w:hAnsi="Arial"/>
-          <w:sz w:val="21"/>
-          <w:szCs w:val="21"/>
-        </w:rPr>
-        <w:t xml:space="preserve"> para ver la plataforma en pantalla y revisar este plan contigo.</w:t>
-      </w:r>
-    </w:p>
-    <w:p>
-      <w:pPr>
-        <w:pStyle w:val="ListParagraph"/>
-        <w:numPr>
-          <w:ilvl w:val="0"/>
-          <w:numId w:val="2"/>
-        </w:numPr>
-        <w:spacing w:after="70" w:line="290"/>
-      </w:pPr>
-      <w:r>
-        <w:rPr>
-          <w:rFonts w:ascii="Arial" w:cs="Arial" w:eastAsia="Arial" w:hAnsi="Arial"/>
-          <w:b/>
-          <w:bCs/>
-          <w:sz w:val="21"/>
-          <w:szCs w:val="21"/>
-        </w:rPr>
-        <w:t xml:space="preserve">Definir el piloto</w:t>
-      </w:r>
-      <w:r>
-        <w:rPr>
-          <w:rFonts w:ascii="Arial" w:cs="Arial" w:eastAsia="Arial" w:hAnsi="Arial"/>
-          <w:sz w:val="21"/>
-          <w:szCs w:val="21"/>
-        </w:rPr>
-        <w:t xml:space="preserve">: las 10 personas, las fechas y qué cuenta como éxito.</w:t>
-      </w:r>
-    </w:p>
-    <w:p>
-      <w:pPr>
-        <w:pStyle w:val="ListParagraph"/>
-        <w:numPr>
-          <w:ilvl w:val="0"/>
-          <w:numId w:val="2"/>
-        </w:numPr>
-        <w:spacing w:after="70" w:line="290"/>
-      </w:pPr>
-      <w:r>
-        <w:rPr>
-          <w:rFonts w:ascii="Arial" w:cs="Arial" w:eastAsia="Arial" w:hAnsi="Arial"/>
-          <w:b/>
-          <w:bCs/>
-          <w:sz w:val="21"/>
-          <w:szCs w:val="21"/>
-        </w:rPr>
-        <w:t xml:space="preserve">Preparar el tutorial</w:t>
-      </w:r>
-      <w:r>
-        <w:rPr>
-          <w:rFonts w:ascii="Arial" w:cs="Arial" w:eastAsia="Arial" w:hAnsi="Arial"/>
-          <w:sz w:val="21"/>
-          <w:szCs w:val="21"/>
-        </w:rPr>
-        <w:t xml:space="preserve"> de pre-diagnóstico para que los creadores lleguen listos.</w:t>
+          <w:sz w:val="21"/>
+          <w:szCs w:val="21"/>
+        </w:rPr>
+        <w:t xml:space="preserve">Hablar de cómo colaborar: </w:t>
+      </w:r>
+      <w:r>
+        <w:rPr>
+          <w:rFonts w:ascii="Arial" w:cs="Arial" w:eastAsia="Arial" w:hAnsi="Arial"/>
+          <w:sz w:val="21"/>
+          <w:szCs w:val="21"/>
+        </w:rPr>
+        <w:t xml:space="preserve">el rol, el ritmo y las condiciones, a partir de lo que veamos en el piloto.</w:t>
       </w:r>
     </w:p>
     <w:p>

</xml_diff>